<commit_message>
Exponential of Delta Exponent Variable | (04:29 (W.I.B [Waktu Indonesia bagian Barat]), 30/3/2026), Batam, Kepulauan Riau, Indonesia | Exponential of Delta Exponent Variable #EXODUS14VERSES14 #PROVERBS11VERSES24 #LUCAS8VERSES24
Exponential of Delta Exponent Variable | (04:29 (W.I.B [Waktu Indonesia bagian Barat]), 30/3/2026), Batam, Kepulauan Riau, Indonesia | Exponential of Delta Exponent Variable #EXODUS14VERSES14 #PROVERBS11VERSES24 #LUCAS8VERSES24
</commit_message>
<xml_diff>
--- a/Exponential of Delta Exponent Variable.docx
+++ b/Exponential of Delta Exponent Variable.docx
@@ -41,6 +41,7 @@
           <w:lang w:val="id-ID"/>
         </w:rPr>
       </w:pPr>
+      <w:proofErr w:type="spellStart"/>
       <w:r>
         <w:rPr>
           <w:rFonts w:ascii="Times New Roman" w:eastAsiaTheme="minorEastAsia" w:hAnsi="Times New Roman" w:cs="Times New Roman"/>
@@ -48,7 +49,37 @@
           <w:szCs w:val="24"/>
           <w:lang w:val="id-ID"/>
         </w:rPr>
-        <w:t>by : Samuel Hasiholan Omega Purba, S. Tr. T.</w:t>
+        <w:t>by</w:t>
+      </w:r>
+      <w:proofErr w:type="spellEnd"/>
+      <w:r>
+        <w:rPr>
+          <w:rFonts w:ascii="Times New Roman" w:eastAsiaTheme="minorEastAsia" w:hAnsi="Times New Roman" w:cs="Times New Roman"/>
+          <w:sz w:val="24"/>
+          <w:szCs w:val="24"/>
+          <w:lang w:val="id-ID"/>
+        </w:rPr>
+        <w:t xml:space="preserve"> : Samuel Hasiholan Omega Purba, S. </w:t>
+      </w:r>
+      <w:proofErr w:type="spellStart"/>
+      <w:r>
+        <w:rPr>
+          <w:rFonts w:ascii="Times New Roman" w:eastAsiaTheme="minorEastAsia" w:hAnsi="Times New Roman" w:cs="Times New Roman"/>
+          <w:sz w:val="24"/>
+          <w:szCs w:val="24"/>
+          <w:lang w:val="id-ID"/>
+        </w:rPr>
+        <w:t>Tr</w:t>
+      </w:r>
+      <w:proofErr w:type="spellEnd"/>
+      <w:r>
+        <w:rPr>
+          <w:rFonts w:ascii="Times New Roman" w:eastAsiaTheme="minorEastAsia" w:hAnsi="Times New Roman" w:cs="Times New Roman"/>
+          <w:sz w:val="24"/>
+          <w:szCs w:val="24"/>
+          <w:lang w:val="id-ID"/>
+        </w:rPr>
+        <w:t>. T.</w:t>
       </w:r>
     </w:p>
     <w:p>
@@ -83,6 +114,7 @@
           <w:lang w:val="id-ID"/>
         </w:rPr>
       </w:pPr>
+      <w:proofErr w:type="spellStart"/>
       <w:r>
         <w:rPr>
           <w:rFonts w:ascii="Times New Roman" w:eastAsiaTheme="minorEastAsia" w:hAnsi="Times New Roman" w:cs="Times New Roman"/>
@@ -90,7 +122,17 @@
           <w:szCs w:val="24"/>
           <w:lang w:val="id-ID"/>
         </w:rPr>
-        <w:t>Prodi Teknik Robotika dan Kecerdasan buatan</w:t>
+        <w:t>Prodi</w:t>
+      </w:r>
+      <w:proofErr w:type="spellEnd"/>
+      <w:r>
+        <w:rPr>
+          <w:rFonts w:ascii="Times New Roman" w:eastAsiaTheme="minorEastAsia" w:hAnsi="Times New Roman" w:cs="Times New Roman"/>
+          <w:sz w:val="24"/>
+          <w:szCs w:val="24"/>
+          <w:lang w:val="id-ID"/>
+        </w:rPr>
+        <w:t xml:space="preserve"> Teknik Robotika dan Kecerdasan buatan</w:t>
       </w:r>
     </w:p>
     <w:p>
@@ -257,7 +299,19 @@
                     <w:rPr>
                       <w:rFonts w:ascii="Cambria Math" w:hAnsi="Cambria Math"/>
                     </w:rPr>
-                    <m:t>x + 1</m:t>
+                    <m:t>x</m:t>
+                  </m:r>
+                  <m:r>
+                    <w:rPr>
+                      <w:rFonts w:ascii="Cambria Math" w:hAnsi="Cambria Math"/>
+                    </w:rPr>
+                    <m:t xml:space="preserve"> -</m:t>
+                  </m:r>
+                  <m:r>
+                    <w:rPr>
+                      <w:rFonts w:ascii="Cambria Math" w:hAnsi="Cambria Math"/>
+                    </w:rPr>
+                    <m:t xml:space="preserve"> 1</m:t>
                   </m:r>
                 </m:e>
               </m:d>

</xml_diff>

<commit_message>
Exponential of Delta Exponent Variable | (04:39 (W.I.B [Waktu Indonesia bagian Barat]), 30/3/2026), Batam, Kepulauan Riau, Indonesia | Exponential of Delta Exponent Variable #EXODUS14VERSES14 #PROVERBS11VERSES24 #LUCAS8VERSES24
Exponential of Delta Exponent Variable | (04:39 (W.I.B [Waktu Indonesia bagian Barat]), 30/3/2026), Batam, Kepulauan Riau, Indonesia | Exponential of Delta Exponent Variable #EXODUS14VERSES14 #PROVERBS11VERSES24 #LUCAS8VERSES24
</commit_message>
<xml_diff>
--- a/Exponential of Delta Exponent Variable.docx
+++ b/Exponential of Delta Exponent Variable.docx
@@ -973,6 +973,238 @@
               </m:d>
             </m:e>
           </m:nary>
+        </m:oMath>
+      </m:oMathPara>
+    </w:p>
+    <w:p>
+      <w:pPr>
+        <w:spacing w:line="360" w:lineRule="auto"/>
+        <w:jc w:val="center"/>
+        <w:rPr>
+          <w:rFonts w:ascii="Times New Roman" w:eastAsiaTheme="minorEastAsia" w:hAnsi="Times New Roman" w:cs="Times New Roman"/>
+          <w:sz w:val="24"/>
+          <w:szCs w:val="24"/>
+          <w:lang w:val="id-ID"/>
+        </w:rPr>
+      </w:pPr>
+    </w:p>
+    <w:p>
+      <w:pPr>
+        <w:spacing w:line="360" w:lineRule="auto"/>
+        <w:jc w:val="center"/>
+        <w:rPr>
+          <w:rFonts w:eastAsiaTheme="minorEastAsia"/>
+        </w:rPr>
+      </w:pPr>
+      <m:oMathPara>
+        <m:oMathParaPr>
+          <m:jc m:val="center"/>
+        </m:oMathParaPr>
+        <m:oMath>
+          <m:nary>
+            <m:naryPr>
+              <m:chr m:val="∑"/>
+              <m:limLoc m:val="undOvr"/>
+              <m:ctrlPr>
+                <w:rPr>
+                  <w:rFonts w:ascii="Cambria Math" w:eastAsiaTheme="minorEastAsia" w:hAnsi="Cambria Math" w:cs="Times New Roman"/>
+                  <w:i/>
+                </w:rPr>
+              </m:ctrlPr>
+            </m:naryPr>
+            <m:sub>
+              <m:d>
+                <m:dPr>
+                  <m:ctrlPr>
+                    <w:rPr>
+                      <w:rFonts w:ascii="Cambria Math" w:eastAsiaTheme="minorEastAsia" w:hAnsi="Cambria Math" w:cs="Times New Roman"/>
+                      <w:i/>
+                    </w:rPr>
+                  </m:ctrlPr>
+                </m:dPr>
+                <m:e>
+                  <m:r>
+                    <w:rPr>
+                      <w:rFonts w:ascii="Cambria Math" w:eastAsiaTheme="minorEastAsia" w:hAnsi="Cambria Math" w:cs="Times New Roman"/>
+                    </w:rPr>
+                    <m:t>x + a</m:t>
+                  </m:r>
+                </m:e>
+              </m:d>
+            </m:sub>
+            <m:sup>
+              <m:d>
+                <m:dPr>
+                  <m:ctrlPr>
+                    <w:rPr>
+                      <w:rFonts w:ascii="Cambria Math" w:eastAsiaTheme="minorEastAsia" w:hAnsi="Cambria Math" w:cs="Times New Roman"/>
+                      <w:i/>
+                    </w:rPr>
+                  </m:ctrlPr>
+                </m:dPr>
+                <m:e>
+                  <m:r>
+                    <w:rPr>
+                      <w:rFonts w:ascii="Cambria Math" w:eastAsiaTheme="minorEastAsia" w:hAnsi="Cambria Math" w:cs="Times New Roman"/>
+                    </w:rPr>
+                    <m:t>n → ∞</m:t>
+                  </m:r>
+                </m:e>
+              </m:d>
+            </m:sup>
+            <m:e>
+              <m:d>
+                <m:dPr>
+                  <m:ctrlPr>
+                    <w:rPr>
+                      <w:rFonts w:ascii="Cambria Math" w:eastAsiaTheme="minorEastAsia" w:hAnsi="Cambria Math" w:cs="Times New Roman"/>
+                      <w:i/>
+                    </w:rPr>
+                  </m:ctrlPr>
+                </m:dPr>
+                <m:e>
+                  <m:sSup>
+                    <m:sSupPr>
+                      <m:ctrlPr>
+                        <w:rPr>
+                          <w:rFonts w:ascii="Cambria Math" w:eastAsiaTheme="minorEastAsia" w:hAnsi="Cambria Math" w:cs="Times New Roman"/>
+                          <w:i/>
+                        </w:rPr>
+                      </m:ctrlPr>
+                    </m:sSupPr>
+                    <m:e>
+                      <m:r>
+                        <w:rPr>
+                          <w:rFonts w:ascii="Cambria Math" w:eastAsiaTheme="minorEastAsia" w:hAnsi="Cambria Math" w:cs="Times New Roman"/>
+                        </w:rPr>
+                        <m:t>x</m:t>
+                      </m:r>
+                    </m:e>
+                    <m:sup>
+                      <m:r>
+                        <w:rPr>
+                          <w:rFonts w:ascii="Cambria Math" w:eastAsiaTheme="minorEastAsia" w:hAnsi="Cambria Math" w:cs="Times New Roman"/>
+                        </w:rPr>
+                        <m:t>n</m:t>
+                      </m:r>
+                    </m:sup>
+                  </m:sSup>
+                  <m:r>
+                    <w:rPr>
+                      <w:rFonts w:ascii="Cambria Math" w:eastAsiaTheme="minorEastAsia" w:hAnsi="Cambria Math" w:cs="Times New Roman"/>
+                    </w:rPr>
+                    <m:t xml:space="preserve">- </m:t>
+                  </m:r>
+                  <m:sSup>
+                    <m:sSupPr>
+                      <m:ctrlPr>
+                        <w:rPr>
+                          <w:rFonts w:ascii="Cambria Math" w:eastAsiaTheme="minorEastAsia" w:hAnsi="Cambria Math" w:cs="Times New Roman"/>
+                          <w:i/>
+                        </w:rPr>
+                      </m:ctrlPr>
+                    </m:sSupPr>
+                    <m:e>
+                      <m:d>
+                        <m:dPr>
+                          <m:ctrlPr>
+                            <w:rPr>
+                              <w:rFonts w:ascii="Cambria Math" w:eastAsiaTheme="minorEastAsia" w:hAnsi="Cambria Math" w:cs="Times New Roman"/>
+                              <w:i/>
+                            </w:rPr>
+                          </m:ctrlPr>
+                        </m:dPr>
+                        <m:e>
+                          <m:r>
+                            <w:rPr>
+                              <w:rFonts w:ascii="Cambria Math" w:eastAsiaTheme="minorEastAsia" w:hAnsi="Cambria Math" w:cs="Times New Roman"/>
+                            </w:rPr>
+                            <m:t>x - a</m:t>
+                          </m:r>
+                        </m:e>
+                      </m:d>
+                    </m:e>
+                    <m:sup>
+                      <m:r>
+                        <w:rPr>
+                          <w:rFonts w:ascii="Cambria Math" w:eastAsiaTheme="minorEastAsia" w:hAnsi="Cambria Math" w:cs="Times New Roman"/>
+                        </w:rPr>
+                        <m:t>n</m:t>
+                      </m:r>
+                    </m:sup>
+                  </m:sSup>
+                </m:e>
+              </m:d>
+            </m:e>
+          </m:nary>
+          <m:r>
+            <w:rPr>
+              <w:rFonts w:ascii="Cambria Math" w:hAnsi="Cambria Math"/>
+            </w:rPr>
+            <m:t xml:space="preserve"> = </m:t>
+          </m:r>
+          <m:d>
+            <m:dPr>
+              <m:ctrlPr>
+                <w:rPr>
+                  <w:rFonts w:ascii="Cambria Math" w:hAnsi="Cambria Math"/>
+                  <w:i/>
+                </w:rPr>
+              </m:ctrlPr>
+            </m:dPr>
+            <m:e>
+              <m:d>
+                <m:dPr>
+                  <m:begChr m:val="{"/>
+                  <m:endChr m:val="}"/>
+                  <m:ctrlPr>
+                    <w:rPr>
+                      <w:rFonts w:ascii="Cambria Math" w:hAnsi="Cambria Math"/>
+                      <w:i/>
+                    </w:rPr>
+                  </m:ctrlPr>
+                </m:dPr>
+                <m:e>
+                  <m:d>
+                    <m:dPr>
+                      <m:ctrlPr>
+                        <w:rPr>
+                          <w:rFonts w:ascii="Cambria Math" w:hAnsi="Cambria Math"/>
+                          <w:i/>
+                        </w:rPr>
+                      </m:ctrlPr>
+                    </m:dPr>
+                    <m:e>
+                      <m:r>
+                        <w:rPr>
+                          <w:rFonts w:ascii="Cambria Math" w:hAnsi="Cambria Math"/>
+                        </w:rPr>
+                        <m:t>x + a</m:t>
+                      </m:r>
+                    </m:e>
+                  </m:d>
+                  <m:r>
+                    <w:rPr>
+                      <w:rFonts w:ascii="Cambria Math" w:hAnsi="Cambria Math"/>
+                    </w:rPr>
+                    <m:t xml:space="preserve"> × a</m:t>
+                  </m:r>
+                </m:e>
+              </m:d>
+              <m:r>
+                <w:rPr>
+                  <w:rFonts w:ascii="Cambria Math" w:hAnsi="Cambria Math"/>
+                </w:rPr>
+                <m:t xml:space="preserve"> -</m:t>
+              </m:r>
+              <m:r>
+                <w:rPr>
+                  <w:rFonts w:ascii="Cambria Math" w:hAnsi="Cambria Math"/>
+                </w:rPr>
+                <m:t>a</m:t>
+              </m:r>
+            </m:e>
+          </m:d>
         </m:oMath>
       </m:oMathPara>
     </w:p>

</xml_diff>

<commit_message>
Exponential of Delta Exponent Variable | (13:36 (W.I.B [Waktu Indonesia bagian Barat]), 31/3/2026), Batam, Kepulauan Riau, Indonesia | Exponential of Delta Exponent Variable #EXODUS14VERSES14 #PROVERBS11VERSES24 #LUCAS8VERSES24
Exponential of Delta Exponent Variable | (13:36 (W.I.B [Waktu Indonesia bagian Barat]), 31/3/2026), Batam, Kepulauan Riau, Indonesia | Exponential of Delta Exponent Variable #EXODUS14VERSES14 #PROVERBS11VERSES24 #LUCAS8VERSES24
</commit_message>
<xml_diff>
--- a/Exponential of Delta Exponent Variable.docx
+++ b/Exponential of Delta Exponent Variable.docx
@@ -305,13 +305,13 @@
                     <w:rPr>
                       <w:rFonts w:ascii="Cambria Math" w:hAnsi="Cambria Math"/>
                     </w:rPr>
-                    <m:t xml:space="preserve"> -</m:t>
-                  </m:r>
-                  <m:r>
-                    <w:rPr>
-                      <w:rFonts w:ascii="Cambria Math" w:hAnsi="Cambria Math"/>
-                    </w:rPr>
-                    <m:t xml:space="preserve"> 1</m:t>
+                    <m:t xml:space="preserve"> + </m:t>
+                  </m:r>
+                  <m:r>
+                    <w:rPr>
+                      <w:rFonts w:ascii="Cambria Math" w:hAnsi="Cambria Math"/>
+                    </w:rPr>
+                    <m:t>1</m:t>
                   </m:r>
                 </m:e>
               </m:d>
@@ -465,7 +465,7 @@
                 <w:rPr>
                   <w:rFonts w:ascii="Cambria Math" w:hAnsi="Cambria Math"/>
                 </w:rPr>
-                <m:t xml:space="preserve"> -</m:t>
+                <m:t xml:space="preserve"> +</m:t>
               </m:r>
               <m:r>
                 <w:rPr>
@@ -569,39 +569,7 @@
                     <m:sSupPr>
                       <m:ctrlPr>
                         <w:rPr>
-                          <w:rFonts w:ascii="Cambria Math" w:eastAsiaTheme="minorEastAsia" w:hAnsi="Cambria Math" w:cs="Times New Roman"/>
-                          <w:i/>
-                        </w:rPr>
-                      </m:ctrlPr>
-                    </m:sSupPr>
-                    <m:e>
-                      <m:r>
-                        <w:rPr>
-                          <w:rFonts w:ascii="Cambria Math" w:eastAsiaTheme="minorEastAsia" w:hAnsi="Cambria Math" w:cs="Times New Roman"/>
-                        </w:rPr>
-                        <m:t>x</m:t>
-                      </m:r>
-                    </m:e>
-                    <m:sup>
-                      <m:r>
-                        <w:rPr>
-                          <w:rFonts w:ascii="Cambria Math" w:eastAsiaTheme="minorEastAsia" w:hAnsi="Cambria Math" w:cs="Times New Roman"/>
-                        </w:rPr>
-                        <m:t>n</m:t>
-                      </m:r>
-                    </m:sup>
-                  </m:sSup>
-                  <m:r>
-                    <w:rPr>
-                      <w:rFonts w:ascii="Cambria Math" w:eastAsiaTheme="minorEastAsia" w:hAnsi="Cambria Math" w:cs="Times New Roman"/>
-                    </w:rPr>
-                    <m:t xml:space="preserve">- </m:t>
-                  </m:r>
-                  <m:sSup>
-                    <m:sSupPr>
-                      <m:ctrlPr>
-                        <w:rPr>
-                          <w:rFonts w:ascii="Cambria Math" w:eastAsiaTheme="minorEastAsia" w:hAnsi="Cambria Math" w:cs="Times New Roman"/>
+                          <w:rFonts w:ascii="Cambria Math" w:hAnsi="Cambria Math"/>
                           <w:i/>
                         </w:rPr>
                       </m:ctrlPr>
@@ -611,7 +579,7 @@
                         <m:dPr>
                           <m:ctrlPr>
                             <w:rPr>
-                              <w:rFonts w:ascii="Cambria Math" w:eastAsiaTheme="minorEastAsia" w:hAnsi="Cambria Math" w:cs="Times New Roman"/>
+                              <w:rFonts w:ascii="Cambria Math" w:hAnsi="Cambria Math"/>
                               <w:i/>
                             </w:rPr>
                           </m:ctrlPr>
@@ -619,12 +587,44 @@
                         <m:e>
                           <m:r>
                             <w:rPr>
-                              <w:rFonts w:ascii="Cambria Math" w:eastAsiaTheme="minorEastAsia" w:hAnsi="Cambria Math" w:cs="Times New Roman"/>
+                              <w:rFonts w:ascii="Cambria Math" w:hAnsi="Cambria Math"/>
                             </w:rPr>
-                            <m:t>x-1</m:t>
+                            <m:t>x+1</m:t>
                           </m:r>
                         </m:e>
                       </m:d>
+                    </m:e>
+                    <m:sup>
+                      <m:r>
+                        <w:rPr>
+                          <w:rFonts w:ascii="Cambria Math" w:hAnsi="Cambria Math"/>
+                        </w:rPr>
+                        <m:t>n</m:t>
+                      </m:r>
+                    </m:sup>
+                  </m:sSup>
+                  <m:r>
+                    <w:rPr>
+                      <w:rFonts w:ascii="Cambria Math" w:hAnsi="Cambria Math"/>
+                    </w:rPr>
+                    <m:t xml:space="preserve"> - </m:t>
+                  </m:r>
+                  <m:sSup>
+                    <m:sSupPr>
+                      <m:ctrlPr>
+                        <w:rPr>
+                          <w:rFonts w:ascii="Cambria Math" w:eastAsiaTheme="minorEastAsia" w:hAnsi="Cambria Math" w:cs="Times New Roman"/>
+                          <w:i/>
+                        </w:rPr>
+                      </m:ctrlPr>
+                    </m:sSupPr>
+                    <m:e>
+                      <m:r>
+                        <w:rPr>
+                          <w:rFonts w:ascii="Cambria Math" w:eastAsiaTheme="minorEastAsia" w:hAnsi="Cambria Math" w:cs="Times New Roman"/>
+                        </w:rPr>
+                        <m:t>x</m:t>
+                      </m:r>
                     </m:e>
                     <m:sup>
                       <m:r>
@@ -711,7 +711,13 @@
                     <w:rPr>
                       <w:rFonts w:ascii="Cambria Math" w:hAnsi="Cambria Math"/>
                     </w:rPr>
-                    <m:t xml:space="preserve"> - 1</m:t>
+                    <m:t xml:space="preserve"> +</m:t>
+                  </m:r>
+                  <m:r>
+                    <w:rPr>
+                      <w:rFonts w:ascii="Cambria Math" w:hAnsi="Cambria Math"/>
+                    </w:rPr>
+                    <m:t xml:space="preserve"> 1</m:t>
                   </m:r>
                 </m:e>
               </m:d>
@@ -811,39 +817,7 @@
                     <m:sSupPr>
                       <m:ctrlPr>
                         <w:rPr>
-                          <w:rFonts w:ascii="Cambria Math" w:eastAsiaTheme="minorEastAsia" w:hAnsi="Cambria Math" w:cs="Times New Roman"/>
-                          <w:i/>
-                        </w:rPr>
-                      </m:ctrlPr>
-                    </m:sSupPr>
-                    <m:e>
-                      <m:r>
-                        <w:rPr>
-                          <w:rFonts w:ascii="Cambria Math" w:eastAsiaTheme="minorEastAsia" w:hAnsi="Cambria Math" w:cs="Times New Roman"/>
-                        </w:rPr>
-                        <m:t>x</m:t>
-                      </m:r>
-                    </m:e>
-                    <m:sup>
-                      <m:r>
-                        <w:rPr>
-                          <w:rFonts w:ascii="Cambria Math" w:eastAsiaTheme="minorEastAsia" w:hAnsi="Cambria Math" w:cs="Times New Roman"/>
-                        </w:rPr>
-                        <m:t>n</m:t>
-                      </m:r>
-                    </m:sup>
-                  </m:sSup>
-                  <m:r>
-                    <w:rPr>
-                      <w:rFonts w:ascii="Cambria Math" w:eastAsiaTheme="minorEastAsia" w:hAnsi="Cambria Math" w:cs="Times New Roman"/>
-                    </w:rPr>
-                    <m:t xml:space="preserve">- </m:t>
-                  </m:r>
-                  <m:sSup>
-                    <m:sSupPr>
-                      <m:ctrlPr>
-                        <w:rPr>
-                          <w:rFonts w:ascii="Cambria Math" w:eastAsiaTheme="minorEastAsia" w:hAnsi="Cambria Math" w:cs="Times New Roman"/>
+                          <w:rFonts w:ascii="Cambria Math" w:hAnsi="Cambria Math"/>
                           <w:i/>
                         </w:rPr>
                       </m:ctrlPr>
@@ -853,7 +827,7 @@
                         <m:dPr>
                           <m:ctrlPr>
                             <w:rPr>
-                              <w:rFonts w:ascii="Cambria Math" w:eastAsiaTheme="minorEastAsia" w:hAnsi="Cambria Math" w:cs="Times New Roman"/>
+                              <w:rFonts w:ascii="Cambria Math" w:hAnsi="Cambria Math"/>
                               <w:i/>
                             </w:rPr>
                           </m:ctrlPr>
@@ -861,12 +835,44 @@
                         <m:e>
                           <m:r>
                             <w:rPr>
-                              <w:rFonts w:ascii="Cambria Math" w:eastAsiaTheme="minorEastAsia" w:hAnsi="Cambria Math" w:cs="Times New Roman"/>
+                              <w:rFonts w:ascii="Cambria Math" w:hAnsi="Cambria Math"/>
                             </w:rPr>
-                            <m:t>x - a</m:t>
+                            <m:t>x+1</m:t>
                           </m:r>
                         </m:e>
                       </m:d>
+                    </m:e>
+                    <m:sup>
+                      <m:r>
+                        <w:rPr>
+                          <w:rFonts w:ascii="Cambria Math" w:hAnsi="Cambria Math"/>
+                        </w:rPr>
+                        <m:t>n</m:t>
+                      </m:r>
+                    </m:sup>
+                  </m:sSup>
+                  <m:r>
+                    <w:rPr>
+                      <w:rFonts w:ascii="Cambria Math" w:hAnsi="Cambria Math"/>
+                    </w:rPr>
+                    <m:t xml:space="preserve"> - </m:t>
+                  </m:r>
+                  <m:sSup>
+                    <m:sSupPr>
+                      <m:ctrlPr>
+                        <w:rPr>
+                          <w:rFonts w:ascii="Cambria Math" w:eastAsiaTheme="minorEastAsia" w:hAnsi="Cambria Math" w:cs="Times New Roman"/>
+                          <w:i/>
+                        </w:rPr>
+                      </m:ctrlPr>
+                    </m:sSupPr>
+                    <m:e>
+                      <m:r>
+                        <w:rPr>
+                          <w:rFonts w:ascii="Cambria Math" w:eastAsiaTheme="minorEastAsia" w:hAnsi="Cambria Math" w:cs="Times New Roman"/>
+                        </w:rPr>
+                        <m:t>x</m:t>
+                      </m:r>
                     </m:e>
                     <m:sup>
                       <m:r>
@@ -947,7 +953,13 @@
                         <w:rPr>
                           <w:rFonts w:ascii="Cambria Math" w:hAnsi="Cambria Math"/>
                         </w:rPr>
-                        <m:t>x × a</m:t>
+                        <m:t xml:space="preserve">x × </m:t>
+                      </m:r>
+                      <m:r>
+                        <w:rPr>
+                          <w:rFonts w:ascii="Cambria Math" w:hAnsi="Cambria Math"/>
+                        </w:rPr>
+                        <m:t>a</m:t>
                       </m:r>
                     </m:e>
                   </m:d>
@@ -955,13 +967,7 @@
                     <w:rPr>
                       <w:rFonts w:ascii="Cambria Math" w:hAnsi="Cambria Math"/>
                     </w:rPr>
-                    <m:t xml:space="preserve"> </m:t>
-                  </m:r>
-                  <m:r>
-                    <w:rPr>
-                      <w:rFonts w:ascii="Cambria Math" w:hAnsi="Cambria Math"/>
-                    </w:rPr>
-                    <m:t>-</m:t>
+                    <m:t>+</m:t>
                   </m:r>
                   <m:r>
                     <w:rPr>
@@ -1067,39 +1073,7 @@
                     <m:sSupPr>
                       <m:ctrlPr>
                         <w:rPr>
-                          <w:rFonts w:ascii="Cambria Math" w:eastAsiaTheme="minorEastAsia" w:hAnsi="Cambria Math" w:cs="Times New Roman"/>
-                          <w:i/>
-                        </w:rPr>
-                      </m:ctrlPr>
-                    </m:sSupPr>
-                    <m:e>
-                      <m:r>
-                        <w:rPr>
-                          <w:rFonts w:ascii="Cambria Math" w:eastAsiaTheme="minorEastAsia" w:hAnsi="Cambria Math" w:cs="Times New Roman"/>
-                        </w:rPr>
-                        <m:t>x</m:t>
-                      </m:r>
-                    </m:e>
-                    <m:sup>
-                      <m:r>
-                        <w:rPr>
-                          <w:rFonts w:ascii="Cambria Math" w:eastAsiaTheme="minorEastAsia" w:hAnsi="Cambria Math" w:cs="Times New Roman"/>
-                        </w:rPr>
-                        <m:t>n</m:t>
-                      </m:r>
-                    </m:sup>
-                  </m:sSup>
-                  <m:r>
-                    <w:rPr>
-                      <w:rFonts w:ascii="Cambria Math" w:eastAsiaTheme="minorEastAsia" w:hAnsi="Cambria Math" w:cs="Times New Roman"/>
-                    </w:rPr>
-                    <m:t xml:space="preserve">- </m:t>
-                  </m:r>
-                  <m:sSup>
-                    <m:sSupPr>
-                      <m:ctrlPr>
-                        <w:rPr>
-                          <w:rFonts w:ascii="Cambria Math" w:eastAsiaTheme="minorEastAsia" w:hAnsi="Cambria Math" w:cs="Times New Roman"/>
+                          <w:rFonts w:ascii="Cambria Math" w:hAnsi="Cambria Math"/>
                           <w:i/>
                         </w:rPr>
                       </m:ctrlPr>
@@ -1109,7 +1083,7 @@
                         <m:dPr>
                           <m:ctrlPr>
                             <w:rPr>
-                              <w:rFonts w:ascii="Cambria Math" w:eastAsiaTheme="minorEastAsia" w:hAnsi="Cambria Math" w:cs="Times New Roman"/>
+                              <w:rFonts w:ascii="Cambria Math" w:hAnsi="Cambria Math"/>
                               <w:i/>
                             </w:rPr>
                           </m:ctrlPr>
@@ -1117,12 +1091,44 @@
                         <m:e>
                           <m:r>
                             <w:rPr>
-                              <w:rFonts w:ascii="Cambria Math" w:eastAsiaTheme="minorEastAsia" w:hAnsi="Cambria Math" w:cs="Times New Roman"/>
+                              <w:rFonts w:ascii="Cambria Math" w:hAnsi="Cambria Math"/>
                             </w:rPr>
-                            <m:t>x - a</m:t>
+                            <m:t>x+1</m:t>
                           </m:r>
                         </m:e>
                       </m:d>
+                    </m:e>
+                    <m:sup>
+                      <m:r>
+                        <w:rPr>
+                          <w:rFonts w:ascii="Cambria Math" w:hAnsi="Cambria Math"/>
+                        </w:rPr>
+                        <m:t>n</m:t>
+                      </m:r>
+                    </m:sup>
+                  </m:sSup>
+                  <m:r>
+                    <w:rPr>
+                      <w:rFonts w:ascii="Cambria Math" w:hAnsi="Cambria Math"/>
+                    </w:rPr>
+                    <m:t xml:space="preserve"> - </m:t>
+                  </m:r>
+                  <m:sSup>
+                    <m:sSupPr>
+                      <m:ctrlPr>
+                        <w:rPr>
+                          <w:rFonts w:ascii="Cambria Math" w:eastAsiaTheme="minorEastAsia" w:hAnsi="Cambria Math" w:cs="Times New Roman"/>
+                          <w:i/>
+                        </w:rPr>
+                      </m:ctrlPr>
+                    </m:sSupPr>
+                    <m:e>
+                      <m:r>
+                        <w:rPr>
+                          <w:rFonts w:ascii="Cambria Math" w:eastAsiaTheme="minorEastAsia" w:hAnsi="Cambria Math" w:cs="Times New Roman"/>
+                        </w:rPr>
+                        <m:t>x</m:t>
+                      </m:r>
                     </m:e>
                     <m:sup>
                       <m:r>
@@ -1195,7 +1201,13 @@
                 <w:rPr>
                   <w:rFonts w:ascii="Cambria Math" w:hAnsi="Cambria Math"/>
                 </w:rPr>
-                <m:t xml:space="preserve"> -</m:t>
+                <m:t xml:space="preserve"> </m:t>
+              </m:r>
+              <m:r>
+                <w:rPr>
+                  <w:rFonts w:ascii="Cambria Math" w:hAnsi="Cambria Math"/>
+                </w:rPr>
+                <m:t xml:space="preserve">+ </m:t>
               </m:r>
               <m:r>
                 <w:rPr>
@@ -1299,39 +1311,7 @@
                     <m:sSupPr>
                       <m:ctrlPr>
                         <w:rPr>
-                          <w:rFonts w:ascii="Cambria Math" w:eastAsiaTheme="minorEastAsia" w:hAnsi="Cambria Math" w:cs="Times New Roman"/>
-                          <w:i/>
-                        </w:rPr>
-                      </m:ctrlPr>
-                    </m:sSupPr>
-                    <m:e>
-                      <m:r>
-                        <w:rPr>
-                          <w:rFonts w:ascii="Cambria Math" w:eastAsiaTheme="minorEastAsia" w:hAnsi="Cambria Math" w:cs="Times New Roman"/>
-                        </w:rPr>
-                        <m:t>x</m:t>
-                      </m:r>
-                    </m:e>
-                    <m:sup>
-                      <m:r>
-                        <w:rPr>
-                          <w:rFonts w:ascii="Cambria Math" w:eastAsiaTheme="minorEastAsia" w:hAnsi="Cambria Math" w:cs="Times New Roman"/>
-                        </w:rPr>
-                        <m:t>n</m:t>
-                      </m:r>
-                    </m:sup>
-                  </m:sSup>
-                  <m:r>
-                    <w:rPr>
-                      <w:rFonts w:ascii="Cambria Math" w:eastAsiaTheme="minorEastAsia" w:hAnsi="Cambria Math" w:cs="Times New Roman"/>
-                    </w:rPr>
-                    <m:t xml:space="preserve">- </m:t>
-                  </m:r>
-                  <m:sSup>
-                    <m:sSupPr>
-                      <m:ctrlPr>
-                        <w:rPr>
-                          <w:rFonts w:ascii="Cambria Math" w:eastAsiaTheme="minorEastAsia" w:hAnsi="Cambria Math" w:cs="Times New Roman"/>
+                          <w:rFonts w:ascii="Cambria Math" w:hAnsi="Cambria Math"/>
                           <w:i/>
                         </w:rPr>
                       </m:ctrlPr>
@@ -1341,7 +1321,7 @@
                         <m:dPr>
                           <m:ctrlPr>
                             <w:rPr>
-                              <w:rFonts w:ascii="Cambria Math" w:eastAsiaTheme="minorEastAsia" w:hAnsi="Cambria Math" w:cs="Times New Roman"/>
+                              <w:rFonts w:ascii="Cambria Math" w:hAnsi="Cambria Math"/>
                               <w:i/>
                             </w:rPr>
                           </m:ctrlPr>
@@ -1349,12 +1329,44 @@
                         <m:e>
                           <m:r>
                             <w:rPr>
-                              <w:rFonts w:ascii="Cambria Math" w:eastAsiaTheme="minorEastAsia" w:hAnsi="Cambria Math" w:cs="Times New Roman"/>
+                              <w:rFonts w:ascii="Cambria Math" w:hAnsi="Cambria Math"/>
                             </w:rPr>
-                            <m:t>x - a</m:t>
+                            <m:t>x+1</m:t>
                           </m:r>
                         </m:e>
                       </m:d>
+                    </m:e>
+                    <m:sup>
+                      <m:r>
+                        <w:rPr>
+                          <w:rFonts w:ascii="Cambria Math" w:hAnsi="Cambria Math"/>
+                        </w:rPr>
+                        <m:t>n</m:t>
+                      </m:r>
+                    </m:sup>
+                  </m:sSup>
+                  <m:r>
+                    <w:rPr>
+                      <w:rFonts w:ascii="Cambria Math" w:hAnsi="Cambria Math"/>
+                    </w:rPr>
+                    <m:t xml:space="preserve"> - </m:t>
+                  </m:r>
+                  <m:sSup>
+                    <m:sSupPr>
+                      <m:ctrlPr>
+                        <w:rPr>
+                          <w:rFonts w:ascii="Cambria Math" w:eastAsiaTheme="minorEastAsia" w:hAnsi="Cambria Math" w:cs="Times New Roman"/>
+                          <w:i/>
+                        </w:rPr>
+                      </m:ctrlPr>
+                    </m:sSupPr>
+                    <m:e>
+                      <m:r>
+                        <w:rPr>
+                          <w:rFonts w:ascii="Cambria Math" w:eastAsiaTheme="minorEastAsia" w:hAnsi="Cambria Math" w:cs="Times New Roman"/>
+                        </w:rPr>
+                        <m:t>x</m:t>
+                      </m:r>
                     </m:e>
                     <m:sup>
                       <m:r>
@@ -1439,19 +1451,13 @@
                 <w:rPr>
                   <w:rFonts w:ascii="Cambria Math" w:hAnsi="Cambria Math"/>
                 </w:rPr>
-                <m:t xml:space="preserve"> -</m:t>
+                <m:t xml:space="preserve"> +</m:t>
               </m:r>
               <m:r>
                 <w:rPr>
                   <w:rFonts w:ascii="Cambria Math" w:hAnsi="Cambria Math"/>
                 </w:rPr>
-                <m:t xml:space="preserve"> </m:t>
-              </m:r>
-              <m:r>
-                <w:rPr>
-                  <w:rFonts w:ascii="Cambria Math" w:hAnsi="Cambria Math"/>
-                </w:rPr>
-                <m:t>a</m:t>
+                <m:t xml:space="preserve"> a</m:t>
               </m:r>
             </m:e>
           </m:d>

</xml_diff>

<commit_message>
Exponential of Delta Exponent Variable | (14:29 (W.I.B [Waktu Indonesia bagian Barat]), 31/3/2026), Batam, Kepulauan Riau, Indonesia | Exponential of Delta Exponent Variable #EXODUS14VERSES14 #PROVERBS11VERSES24 #LUCAS8VERSES24
Exponential of Delta Exponent Variable | (14:29 (W.I.B [Waktu Indonesia bagian Barat]), 31/3/2026), Batam, Kepulauan Riau, Indonesia | Exponential of Delta Exponent Variable #EXODUS14VERSES14 #PROVERBS11VERSES24 #LUCAS8VERSES24
</commit_message>
<xml_diff>
--- a/Exponential of Delta Exponent Variable.docx
+++ b/Exponential of Delta Exponent Variable.docx
@@ -299,19 +299,7 @@
                     <w:rPr>
                       <w:rFonts w:ascii="Cambria Math" w:hAnsi="Cambria Math"/>
                     </w:rPr>
-                    <m:t>x</m:t>
-                  </m:r>
-                  <m:r>
-                    <w:rPr>
-                      <w:rFonts w:ascii="Cambria Math" w:hAnsi="Cambria Math"/>
-                    </w:rPr>
-                    <m:t xml:space="preserve"> + </m:t>
-                  </m:r>
-                  <m:r>
-                    <w:rPr>
-                      <w:rFonts w:ascii="Cambria Math" w:hAnsi="Cambria Math"/>
-                    </w:rPr>
-                    <m:t>1</m:t>
+                    <m:t>x + 1</m:t>
                   </m:r>
                 </m:e>
               </m:d>
@@ -465,13 +453,7 @@
                 <w:rPr>
                   <w:rFonts w:ascii="Cambria Math" w:hAnsi="Cambria Math"/>
                 </w:rPr>
-                <m:t xml:space="preserve"> +</m:t>
-              </m:r>
-              <m:r>
-                <w:rPr>
-                  <w:rFonts w:ascii="Cambria Math" w:hAnsi="Cambria Math"/>
-                </w:rPr>
-                <m:t xml:space="preserve"> 1</m:t>
+                <m:t xml:space="preserve"> + 1</m:t>
               </m:r>
             </m:e>
           </m:d>
@@ -711,13 +693,7 @@
                     <w:rPr>
                       <w:rFonts w:ascii="Cambria Math" w:hAnsi="Cambria Math"/>
                     </w:rPr>
-                    <m:t xml:space="preserve"> +</m:t>
-                  </m:r>
-                  <m:r>
-                    <w:rPr>
-                      <w:rFonts w:ascii="Cambria Math" w:hAnsi="Cambria Math"/>
-                    </w:rPr>
-                    <m:t xml:space="preserve"> 1</m:t>
+                    <m:t xml:space="preserve"> + 1</m:t>
                   </m:r>
                 </m:e>
               </m:d>
@@ -837,7 +813,7 @@
                             <w:rPr>
                               <w:rFonts w:ascii="Cambria Math" w:hAnsi="Cambria Math"/>
                             </w:rPr>
-                            <m:t>x+1</m:t>
+                            <m:t>x+ a</m:t>
                           </m:r>
                         </m:e>
                       </m:d>
@@ -953,13 +929,7 @@
                         <w:rPr>
                           <w:rFonts w:ascii="Cambria Math" w:hAnsi="Cambria Math"/>
                         </w:rPr>
-                        <m:t xml:space="preserve">x × </m:t>
-                      </m:r>
-                      <m:r>
-                        <w:rPr>
-                          <w:rFonts w:ascii="Cambria Math" w:hAnsi="Cambria Math"/>
-                        </w:rPr>
-                        <m:t>a</m:t>
+                        <m:t>x × a</m:t>
                       </m:r>
                     </m:e>
                   </m:d>
@@ -967,13 +937,7 @@
                     <w:rPr>
                       <w:rFonts w:ascii="Cambria Math" w:hAnsi="Cambria Math"/>
                     </w:rPr>
-                    <m:t>+</m:t>
-                  </m:r>
-                  <m:r>
-                    <w:rPr>
-                      <w:rFonts w:ascii="Cambria Math" w:hAnsi="Cambria Math"/>
-                    </w:rPr>
-                    <m:t xml:space="preserve"> a</m:t>
+                    <m:t>+ a</m:t>
                   </m:r>
                 </m:e>
               </m:d>
@@ -1093,7 +1057,7 @@
                             <w:rPr>
                               <w:rFonts w:ascii="Cambria Math" w:hAnsi="Cambria Math"/>
                             </w:rPr>
-                            <m:t>x+1</m:t>
+                            <m:t>x+ a</m:t>
                           </m:r>
                         </m:e>
                       </m:d>
@@ -1201,19 +1165,7 @@
                 <w:rPr>
                   <w:rFonts w:ascii="Cambria Math" w:hAnsi="Cambria Math"/>
                 </w:rPr>
-                <m:t xml:space="preserve"> </m:t>
-              </m:r>
-              <m:r>
-                <w:rPr>
-                  <w:rFonts w:ascii="Cambria Math" w:hAnsi="Cambria Math"/>
-                </w:rPr>
-                <m:t xml:space="preserve">+ </m:t>
-              </m:r>
-              <m:r>
-                <w:rPr>
-                  <w:rFonts w:ascii="Cambria Math" w:hAnsi="Cambria Math"/>
-                </w:rPr>
-                <m:t>a</m:t>
+                <m:t xml:space="preserve"> + a</m:t>
               </m:r>
             </m:e>
           </m:d>
@@ -1297,6 +1249,7 @@
               </m:d>
             </m:sup>
             <m:e>
+              <w:bookmarkStart w:id="0" w:name="_Hlk225859689"/>
               <m:d>
                 <m:dPr>
                   <m:ctrlPr>
@@ -1331,7 +1284,13 @@
                             <w:rPr>
                               <w:rFonts w:ascii="Cambria Math" w:hAnsi="Cambria Math"/>
                             </w:rPr>
-                            <m:t>x+1</m:t>
+                            <m:t>x+</m:t>
+                          </m:r>
+                          <m:r>
+                            <w:rPr>
+                              <w:rFonts w:ascii="Cambria Math" w:hAnsi="Cambria Math"/>
+                            </w:rPr>
+                            <m:t xml:space="preserve"> a</m:t>
                           </m:r>
                         </m:e>
                       </m:d>
@@ -1379,6 +1338,7 @@
                   </m:sSup>
                 </m:e>
               </m:d>
+              <w:bookmarkEnd w:id="0"/>
             </m:e>
           </m:nary>
           <m:r>
@@ -1451,13 +1411,7 @@
                 <w:rPr>
                   <w:rFonts w:ascii="Cambria Math" w:hAnsi="Cambria Math"/>
                 </w:rPr>
-                <m:t xml:space="preserve"> +</m:t>
-              </m:r>
-              <m:r>
-                <w:rPr>
-                  <w:rFonts w:ascii="Cambria Math" w:hAnsi="Cambria Math"/>
-                </w:rPr>
-                <m:t xml:space="preserve"> a</m:t>
+                <m:t xml:space="preserve"> + a</m:t>
               </m:r>
             </m:e>
           </m:d>

</xml_diff>

<commit_message>
Exponential of Delta Exponent Variable | (14:31 (W.I.B [Waktu Indonesia bagian Barat]), 31/3/2026), Batam, Kepulauan Riau, Indonesia | Exponential of Delta Exponent Variable #EXODUS14VERSES14 #PROVERBS11VERSES24 #LUCAS8VERSES24
Exponential of Delta Exponent Variable | (14:31 (W.I.B [Waktu Indonesia bagian Barat]), 31/3/2026), Batam, Kepulauan Riau, Indonesia | Exponential of Delta Exponent Variable #EXODUS14VERSES14 #PROVERBS11VERSES24 #LUCAS8VERSES24
</commit_message>
<xml_diff>
--- a/Exponential of Delta Exponent Variable.docx
+++ b/Exponential of Delta Exponent Variable.docx
@@ -571,7 +571,31 @@
                             <w:rPr>
                               <w:rFonts w:ascii="Cambria Math" w:hAnsi="Cambria Math"/>
                             </w:rPr>
-                            <m:t>x+1</m:t>
+                            <m:t>x</m:t>
+                          </m:r>
+                          <m:r>
+                            <w:rPr>
+                              <w:rFonts w:ascii="Cambria Math" w:hAnsi="Cambria Math"/>
+                            </w:rPr>
+                            <m:t xml:space="preserve"> </m:t>
+                          </m:r>
+                          <m:r>
+                            <w:rPr>
+                              <w:rFonts w:ascii="Cambria Math" w:hAnsi="Cambria Math"/>
+                            </w:rPr>
+                            <m:t>+</m:t>
+                          </m:r>
+                          <m:r>
+                            <w:rPr>
+                              <w:rFonts w:ascii="Cambria Math" w:hAnsi="Cambria Math"/>
+                            </w:rPr>
+                            <m:t xml:space="preserve"> </m:t>
+                          </m:r>
+                          <m:r>
+                            <w:rPr>
+                              <w:rFonts w:ascii="Cambria Math" w:hAnsi="Cambria Math"/>
+                            </w:rPr>
+                            <m:t>1</m:t>
                           </m:r>
                         </m:e>
                       </m:d>
@@ -813,7 +837,19 @@
                             <w:rPr>
                               <w:rFonts w:ascii="Cambria Math" w:hAnsi="Cambria Math"/>
                             </w:rPr>
-                            <m:t>x+ a</m:t>
+                            <m:t>x</m:t>
+                          </m:r>
+                          <m:r>
+                            <w:rPr>
+                              <w:rFonts w:ascii="Cambria Math" w:hAnsi="Cambria Math"/>
+                            </w:rPr>
+                            <m:t xml:space="preserve"> </m:t>
+                          </m:r>
+                          <m:r>
+                            <w:rPr>
+                              <w:rFonts w:ascii="Cambria Math" w:hAnsi="Cambria Math"/>
+                            </w:rPr>
+                            <m:t>+ a</m:t>
                           </m:r>
                         </m:e>
                       </m:d>
@@ -1057,7 +1093,19 @@
                             <w:rPr>
                               <w:rFonts w:ascii="Cambria Math" w:hAnsi="Cambria Math"/>
                             </w:rPr>
-                            <m:t>x+ a</m:t>
+                            <m:t>x</m:t>
+                          </m:r>
+                          <m:r>
+                            <w:rPr>
+                              <w:rFonts w:ascii="Cambria Math" w:hAnsi="Cambria Math"/>
+                            </w:rPr>
+                            <m:t xml:space="preserve"> </m:t>
+                          </m:r>
+                          <m:r>
+                            <w:rPr>
+                              <w:rFonts w:ascii="Cambria Math" w:hAnsi="Cambria Math"/>
+                            </w:rPr>
+                            <m:t>+ a</m:t>
                           </m:r>
                         </m:e>
                       </m:d>
@@ -1284,7 +1332,19 @@
                             <w:rPr>
                               <w:rFonts w:ascii="Cambria Math" w:hAnsi="Cambria Math"/>
                             </w:rPr>
-                            <m:t>x+</m:t>
+                            <m:t>x</m:t>
+                          </m:r>
+                          <m:r>
+                            <w:rPr>
+                              <w:rFonts w:ascii="Cambria Math" w:hAnsi="Cambria Math"/>
+                            </w:rPr>
+                            <m:t xml:space="preserve"> </m:t>
+                          </m:r>
+                          <m:r>
+                            <w:rPr>
+                              <w:rFonts w:ascii="Cambria Math" w:hAnsi="Cambria Math"/>
+                            </w:rPr>
+                            <m:t>+</m:t>
                           </m:r>
                           <m:r>
                             <w:rPr>

</xml_diff>

<commit_message>
Exponential of Delta Exponent Variable | (23:49 (W.I.B [Waktu Indonesia bagian Barat]), 31/3/2026), Batam, Kepulauan Riau, Indonesia | Exponential of Delta Exponent Variable #EXODUS14VERSES14 #PROVERBS11VERSES24 #LUCAS8VERSES24
Exponential of Delta Exponent Variable | (23:49 (W.I.B [Waktu Indonesia bagian Barat]), 31/3/2026), Batam, Kepulauan Riau, Indonesia | Exponential of Delta Exponent Variable #EXODUS14VERSES14 #PROVERBS11VERSES24 #LUCAS8VERSES24
</commit_message>
<xml_diff>
--- a/Exponential of Delta Exponent Variable.docx
+++ b/Exponential of Delta Exponent Variable.docx
@@ -571,31 +571,7 @@
                             <w:rPr>
                               <w:rFonts w:ascii="Cambria Math" w:hAnsi="Cambria Math"/>
                             </w:rPr>
-                            <m:t>x</m:t>
-                          </m:r>
-                          <m:r>
-                            <w:rPr>
-                              <w:rFonts w:ascii="Cambria Math" w:hAnsi="Cambria Math"/>
-                            </w:rPr>
-                            <m:t xml:space="preserve"> </m:t>
-                          </m:r>
-                          <m:r>
-                            <w:rPr>
-                              <w:rFonts w:ascii="Cambria Math" w:hAnsi="Cambria Math"/>
-                            </w:rPr>
-                            <m:t>+</m:t>
-                          </m:r>
-                          <m:r>
-                            <w:rPr>
-                              <w:rFonts w:ascii="Cambria Math" w:hAnsi="Cambria Math"/>
-                            </w:rPr>
-                            <m:t xml:space="preserve"> </m:t>
-                          </m:r>
-                          <m:r>
-                            <w:rPr>
-                              <w:rFonts w:ascii="Cambria Math" w:hAnsi="Cambria Math"/>
-                            </w:rPr>
-                            <m:t>1</m:t>
+                            <m:t>x + 1</m:t>
                           </m:r>
                         </m:e>
                       </m:d>
@@ -837,19 +813,7 @@
                             <w:rPr>
                               <w:rFonts w:ascii="Cambria Math" w:hAnsi="Cambria Math"/>
                             </w:rPr>
-                            <m:t>x</m:t>
-                          </m:r>
-                          <m:r>
-                            <w:rPr>
-                              <w:rFonts w:ascii="Cambria Math" w:hAnsi="Cambria Math"/>
-                            </w:rPr>
-                            <m:t xml:space="preserve"> </m:t>
-                          </m:r>
-                          <m:r>
-                            <w:rPr>
-                              <w:rFonts w:ascii="Cambria Math" w:hAnsi="Cambria Math"/>
-                            </w:rPr>
-                            <m:t>+ a</m:t>
+                            <m:t>x + a</m:t>
                           </m:r>
                         </m:e>
                       </m:d>
@@ -1093,19 +1057,7 @@
                             <w:rPr>
                               <w:rFonts w:ascii="Cambria Math" w:hAnsi="Cambria Math"/>
                             </w:rPr>
-                            <m:t>x</m:t>
-                          </m:r>
-                          <m:r>
-                            <w:rPr>
-                              <w:rFonts w:ascii="Cambria Math" w:hAnsi="Cambria Math"/>
-                            </w:rPr>
-                            <m:t xml:space="preserve"> </m:t>
-                          </m:r>
-                          <m:r>
-                            <w:rPr>
-                              <w:rFonts w:ascii="Cambria Math" w:hAnsi="Cambria Math"/>
-                            </w:rPr>
-                            <m:t>+ a</m:t>
+                            <m:t>x + a</m:t>
                           </m:r>
                         </m:e>
                       </m:d>
@@ -1161,20 +1113,42 @@
             </w:rPr>
             <m:t xml:space="preserve"> = </m:t>
           </m:r>
-          <m:d>
-            <m:dPr>
+          <m:nary>
+            <m:naryPr>
+              <m:chr m:val="∑"/>
+              <m:limLoc m:val="undOvr"/>
+              <m:supHide m:val="1"/>
               <m:ctrlPr>
                 <w:rPr>
                   <w:rFonts w:ascii="Cambria Math" w:hAnsi="Cambria Math"/>
                   <w:i/>
                 </w:rPr>
               </m:ctrlPr>
-            </m:dPr>
+            </m:naryPr>
+            <m:sub>
+              <m:d>
+                <m:dPr>
+                  <m:ctrlPr>
+                    <w:rPr>
+                      <w:rFonts w:ascii="Cambria Math" w:eastAsiaTheme="minorEastAsia" w:hAnsi="Cambria Math" w:cs="Times New Roman"/>
+                      <w:i/>
+                    </w:rPr>
+                  </m:ctrlPr>
+                </m:dPr>
+                <m:e>
+                  <m:r>
+                    <w:rPr>
+                      <w:rFonts w:ascii="Cambria Math" w:eastAsiaTheme="minorEastAsia" w:hAnsi="Cambria Math" w:cs="Times New Roman"/>
+                    </w:rPr>
+                    <m:t>x + a</m:t>
+                  </m:r>
+                </m:e>
+              </m:d>
+            </m:sub>
+            <m:sup/>
             <m:e>
               <m:d>
                 <m:dPr>
-                  <m:begChr m:val="{"/>
-                  <m:endChr m:val="}"/>
                   <m:ctrlPr>
                     <w:rPr>
                       <w:rFonts w:ascii="Cambria Math" w:hAnsi="Cambria Math"/>
@@ -1185,6 +1159,8 @@
                 <m:e>
                   <m:d>
                     <m:dPr>
+                      <m:begChr m:val="{"/>
+                      <m:endChr m:val="}"/>
                       <m:ctrlPr>
                         <w:rPr>
                           <w:rFonts w:ascii="Cambria Math" w:hAnsi="Cambria Math"/>
@@ -1193,11 +1169,29 @@
                       </m:ctrlPr>
                     </m:dPr>
                     <m:e>
+                      <m:d>
+                        <m:dPr>
+                          <m:ctrlPr>
+                            <w:rPr>
+                              <w:rFonts w:ascii="Cambria Math" w:hAnsi="Cambria Math"/>
+                              <w:i/>
+                            </w:rPr>
+                          </m:ctrlPr>
+                        </m:dPr>
+                        <m:e>
+                          <m:r>
+                            <w:rPr>
+                              <w:rFonts w:ascii="Cambria Math" w:hAnsi="Cambria Math"/>
+                            </w:rPr>
+                            <m:t>x + a</m:t>
+                          </m:r>
+                        </m:e>
+                      </m:d>
                       <m:r>
                         <w:rPr>
                           <w:rFonts w:ascii="Cambria Math" w:hAnsi="Cambria Math"/>
                         </w:rPr>
-                        <m:t>x + a</m:t>
+                        <m:t xml:space="preserve"> × a</m:t>
                       </m:r>
                     </m:e>
                   </m:d>
@@ -1205,18 +1199,12 @@
                     <w:rPr>
                       <w:rFonts w:ascii="Cambria Math" w:hAnsi="Cambria Math"/>
                     </w:rPr>
-                    <m:t xml:space="preserve"> × a</m:t>
+                    <m:t xml:space="preserve"> + a</m:t>
                   </m:r>
                 </m:e>
               </m:d>
-              <m:r>
-                <w:rPr>
-                  <w:rFonts w:ascii="Cambria Math" w:hAnsi="Cambria Math"/>
-                </w:rPr>
-                <m:t xml:space="preserve"> + a</m:t>
-              </m:r>
             </m:e>
-          </m:d>
+          </m:nary>
         </m:oMath>
       </m:oMathPara>
     </w:p>
@@ -1332,25 +1320,7 @@
                             <w:rPr>
                               <w:rFonts w:ascii="Cambria Math" w:hAnsi="Cambria Math"/>
                             </w:rPr>
-                            <m:t>x</m:t>
-                          </m:r>
-                          <m:r>
-                            <w:rPr>
-                              <w:rFonts w:ascii="Cambria Math" w:hAnsi="Cambria Math"/>
-                            </w:rPr>
-                            <m:t xml:space="preserve"> </m:t>
-                          </m:r>
-                          <m:r>
-                            <w:rPr>
-                              <w:rFonts w:ascii="Cambria Math" w:hAnsi="Cambria Math"/>
-                            </w:rPr>
-                            <m:t>+</m:t>
-                          </m:r>
-                          <m:r>
-                            <w:rPr>
-                              <w:rFonts w:ascii="Cambria Math" w:hAnsi="Cambria Math"/>
-                            </w:rPr>
-                            <m:t xml:space="preserve"> a</m:t>
+                            <m:t>x + a</m:t>
                           </m:r>
                         </m:e>
                       </m:d>
@@ -1407,53 +1377,24 @@
             </w:rPr>
             <m:t xml:space="preserve"> = </m:t>
           </m:r>
-          <m:d>
-            <m:dPr>
+          <m:nary>
+            <m:naryPr>
+              <m:chr m:val="∑"/>
+              <m:limLoc m:val="undOvr"/>
+              <m:supHide m:val="1"/>
               <m:ctrlPr>
                 <w:rPr>
                   <w:rFonts w:ascii="Cambria Math" w:hAnsi="Cambria Math"/>
                   <w:i/>
                 </w:rPr>
               </m:ctrlPr>
-            </m:dPr>
-            <m:e>
-              <m:sSup>
-                <m:sSupPr>
-                  <m:ctrlPr>
-                    <w:rPr>
-                      <w:rFonts w:ascii="Cambria Math" w:hAnsi="Cambria Math"/>
-                      <w:i/>
-                    </w:rPr>
-                  </m:ctrlPr>
-                </m:sSupPr>
-                <m:e>
-                  <m:r>
-                    <w:rPr>
-                      <w:rFonts w:ascii="Cambria Math" w:hAnsi="Cambria Math"/>
-                    </w:rPr>
-                    <m:t>a</m:t>
-                  </m:r>
-                </m:e>
-                <m:sup>
-                  <m:r>
-                    <w:rPr>
-                      <w:rFonts w:ascii="Cambria Math" w:hAnsi="Cambria Math"/>
-                    </w:rPr>
-                    <m:t>2</m:t>
-                  </m:r>
-                </m:sup>
-              </m:sSup>
-              <m:r>
-                <w:rPr>
-                  <w:rFonts w:ascii="Cambria Math" w:hAnsi="Cambria Math"/>
-                </w:rPr>
-                <m:t xml:space="preserve"> + </m:t>
-              </m:r>
+            </m:naryPr>
+            <m:sub>
               <m:d>
                 <m:dPr>
                   <m:ctrlPr>
                     <w:rPr>
-                      <w:rFonts w:ascii="Cambria Math" w:hAnsi="Cambria Math"/>
+                      <w:rFonts w:ascii="Cambria Math" w:eastAsiaTheme="minorEastAsia" w:hAnsi="Cambria Math" w:cs="Times New Roman"/>
                       <w:i/>
                     </w:rPr>
                   </m:ctrlPr>
@@ -1461,20 +1402,85 @@
                 <m:e>
                   <m:r>
                     <w:rPr>
-                      <w:rFonts w:ascii="Cambria Math" w:hAnsi="Cambria Math"/>
-                    </w:rPr>
-                    <m:t>x × a</m:t>
+                      <w:rFonts w:ascii="Cambria Math" w:eastAsiaTheme="minorEastAsia" w:hAnsi="Cambria Math" w:cs="Times New Roman"/>
+                    </w:rPr>
+                    <m:t>x + a</m:t>
                   </m:r>
                 </m:e>
               </m:d>
-              <m:r>
-                <w:rPr>
-                  <w:rFonts w:ascii="Cambria Math" w:hAnsi="Cambria Math"/>
-                </w:rPr>
-                <m:t xml:space="preserve"> + a</m:t>
-              </m:r>
+            </m:sub>
+            <m:sup/>
+            <m:e>
+              <m:d>
+                <m:dPr>
+                  <m:ctrlPr>
+                    <w:rPr>
+                      <w:rFonts w:ascii="Cambria Math" w:hAnsi="Cambria Math"/>
+                      <w:i/>
+                    </w:rPr>
+                  </m:ctrlPr>
+                </m:dPr>
+                <m:e>
+                  <m:sSup>
+                    <m:sSupPr>
+                      <m:ctrlPr>
+                        <w:rPr>
+                          <w:rFonts w:ascii="Cambria Math" w:hAnsi="Cambria Math"/>
+                          <w:i/>
+                        </w:rPr>
+                      </m:ctrlPr>
+                    </m:sSupPr>
+                    <m:e>
+                      <m:r>
+                        <w:rPr>
+                          <w:rFonts w:ascii="Cambria Math" w:hAnsi="Cambria Math"/>
+                        </w:rPr>
+                        <m:t>a</m:t>
+                      </m:r>
+                    </m:e>
+                    <m:sup>
+                      <m:r>
+                        <w:rPr>
+                          <w:rFonts w:ascii="Cambria Math" w:hAnsi="Cambria Math"/>
+                        </w:rPr>
+                        <m:t>2</m:t>
+                      </m:r>
+                    </m:sup>
+                  </m:sSup>
+                  <m:r>
+                    <w:rPr>
+                      <w:rFonts w:ascii="Cambria Math" w:hAnsi="Cambria Math"/>
+                    </w:rPr>
+                    <m:t xml:space="preserve"> + </m:t>
+                  </m:r>
+                  <m:d>
+                    <m:dPr>
+                      <m:ctrlPr>
+                        <w:rPr>
+                          <w:rFonts w:ascii="Cambria Math" w:hAnsi="Cambria Math"/>
+                          <w:i/>
+                        </w:rPr>
+                      </m:ctrlPr>
+                    </m:dPr>
+                    <m:e>
+                      <m:r>
+                        <w:rPr>
+                          <w:rFonts w:ascii="Cambria Math" w:hAnsi="Cambria Math"/>
+                        </w:rPr>
+                        <m:t>x × a</m:t>
+                      </m:r>
+                    </m:e>
+                  </m:d>
+                  <m:r>
+                    <w:rPr>
+                      <w:rFonts w:ascii="Cambria Math" w:hAnsi="Cambria Math"/>
+                    </w:rPr>
+                    <m:t xml:space="preserve"> + a</m:t>
+                  </m:r>
+                </m:e>
+              </m:d>
             </m:e>
-          </m:d>
+          </m:nary>
         </m:oMath>
       </m:oMathPara>
     </w:p>

</xml_diff>

<commit_message>
Exponential of Delta Exponent Variable | (23:59 (W.I.B [Waktu Indonesia bagian Barat]), 31/3/2026), Batam, Kepulauan Riau, Indonesia | Exponential of Delta Exponent Variable #EXODUS14VERSES14 #PROVERBS11VERSES24 #LUCAS8VERSES24
Exponential of Delta Exponent Variable | (23:59 (W.I.B [Waktu Indonesia bagian Barat]), 31/3/2026), Batam, Kepulauan Riau, Indonesia | Exponential of Delta Exponent Variable #EXODUS14VERSES14 #PROVERBS11VERSES24 #LUCAS8VERSES24
</commit_message>
<xml_diff>
--- a/Exponential of Delta Exponent Variable.docx
+++ b/Exponential of Delta Exponent Variable.docx
@@ -1481,6 +1481,196 @@
               </m:d>
             </m:e>
           </m:nary>
+        </m:oMath>
+      </m:oMathPara>
+    </w:p>
+    <w:p>
+      <w:pPr>
+        <w:spacing w:line="360" w:lineRule="auto"/>
+        <w:jc w:val="center"/>
+        <w:rPr>
+          <w:rFonts w:ascii="Times New Roman" w:eastAsiaTheme="minorEastAsia" w:hAnsi="Times New Roman" w:cs="Times New Roman"/>
+          <w:sz w:val="24"/>
+          <w:szCs w:val="24"/>
+          <w:lang w:val="id-ID"/>
+        </w:rPr>
+      </w:pPr>
+    </w:p>
+    <w:p>
+      <w:pPr>
+        <w:spacing w:line="360" w:lineRule="auto"/>
+        <w:jc w:val="center"/>
+        <w:rPr>
+          <w:rFonts w:eastAsiaTheme="minorEastAsia"/>
+        </w:rPr>
+      </w:pPr>
+      <m:oMathPara>
+        <m:oMathParaPr>
+          <m:jc m:val="center"/>
+        </m:oMathParaPr>
+        <m:oMath>
+          <m:d>
+            <m:dPr>
+              <m:ctrlPr>
+                <w:rPr>
+                  <w:rFonts w:ascii="Cambria Math" w:eastAsiaTheme="minorEastAsia" w:hAnsi="Cambria Math" w:cs="Times New Roman"/>
+                  <w:i/>
+                </w:rPr>
+              </m:ctrlPr>
+            </m:dPr>
+            <m:e>
+              <m:sSup>
+                <m:sSupPr>
+                  <m:ctrlPr>
+                    <w:rPr>
+                      <w:rFonts w:ascii="Cambria Math" w:hAnsi="Cambria Math"/>
+                      <w:i/>
+                    </w:rPr>
+                  </m:ctrlPr>
+                </m:sSupPr>
+                <m:e>
+                  <m:d>
+                    <m:dPr>
+                      <m:ctrlPr>
+                        <w:rPr>
+                          <w:rFonts w:ascii="Cambria Math" w:hAnsi="Cambria Math"/>
+                          <w:i/>
+                        </w:rPr>
+                      </m:ctrlPr>
+                    </m:dPr>
+                    <m:e>
+                      <m:r>
+                        <w:rPr>
+                          <w:rFonts w:ascii="Cambria Math" w:hAnsi="Cambria Math"/>
+                        </w:rPr>
+                        <m:t>x + a</m:t>
+                      </m:r>
+                    </m:e>
+                  </m:d>
+                </m:e>
+                <m:sup>
+                  <m:r>
+                    <w:rPr>
+                      <w:rFonts w:ascii="Cambria Math" w:hAnsi="Cambria Math"/>
+                    </w:rPr>
+                    <m:t>n</m:t>
+                  </m:r>
+                </m:sup>
+              </m:sSup>
+              <m:r>
+                <w:rPr>
+                  <w:rFonts w:ascii="Cambria Math" w:hAnsi="Cambria Math"/>
+                </w:rPr>
+                <m:t xml:space="preserve"> - </m:t>
+              </m:r>
+              <m:sSup>
+                <m:sSupPr>
+                  <m:ctrlPr>
+                    <w:rPr>
+                      <w:rFonts w:ascii="Cambria Math" w:eastAsiaTheme="minorEastAsia" w:hAnsi="Cambria Math" w:cs="Times New Roman"/>
+                      <w:i/>
+                    </w:rPr>
+                  </m:ctrlPr>
+                </m:sSupPr>
+                <m:e>
+                  <m:r>
+                    <w:rPr>
+                      <w:rFonts w:ascii="Cambria Math" w:eastAsiaTheme="minorEastAsia" w:hAnsi="Cambria Math" w:cs="Times New Roman"/>
+                    </w:rPr>
+                    <m:t>x</m:t>
+                  </m:r>
+                </m:e>
+                <m:sup>
+                  <m:r>
+                    <w:rPr>
+                      <w:rFonts w:ascii="Cambria Math" w:eastAsiaTheme="minorEastAsia" w:hAnsi="Cambria Math" w:cs="Times New Roman"/>
+                    </w:rPr>
+                    <m:t>n</m:t>
+                  </m:r>
+                </m:sup>
+              </m:sSup>
+            </m:e>
+          </m:d>
+          <m:r>
+            <w:rPr>
+              <w:rFonts w:ascii="Cambria Math" w:hAnsi="Cambria Math"/>
+            </w:rPr>
+            <m:t xml:space="preserve"> =</m:t>
+          </m:r>
+          <m:r>
+            <w:rPr>
+              <w:rFonts w:ascii="Cambria Math" w:hAnsi="Cambria Math"/>
+            </w:rPr>
+            <m:t xml:space="preserve"> </m:t>
+          </m:r>
+          <m:d>
+            <m:dPr>
+              <m:ctrlPr>
+                <w:rPr>
+                  <w:rFonts w:ascii="Cambria Math" w:hAnsi="Cambria Math"/>
+                  <w:i/>
+                </w:rPr>
+              </m:ctrlPr>
+            </m:dPr>
+            <m:e>
+              <m:sSup>
+                <m:sSupPr>
+                  <m:ctrlPr>
+                    <w:rPr>
+                      <w:rFonts w:ascii="Cambria Math" w:hAnsi="Cambria Math"/>
+                      <w:i/>
+                    </w:rPr>
+                  </m:ctrlPr>
+                </m:sSupPr>
+                <m:e>
+                  <m:r>
+                    <w:rPr>
+                      <w:rFonts w:ascii="Cambria Math" w:hAnsi="Cambria Math"/>
+                    </w:rPr>
+                    <m:t>a</m:t>
+                  </m:r>
+                </m:e>
+                <m:sup>
+                  <m:r>
+                    <w:rPr>
+                      <w:rFonts w:ascii="Cambria Math" w:hAnsi="Cambria Math"/>
+                    </w:rPr>
+                    <m:t>2</m:t>
+                  </m:r>
+                </m:sup>
+              </m:sSup>
+              <m:r>
+                <w:rPr>
+                  <w:rFonts w:ascii="Cambria Math" w:hAnsi="Cambria Math"/>
+                </w:rPr>
+                <m:t xml:space="preserve"> + </m:t>
+              </m:r>
+              <m:d>
+                <m:dPr>
+                  <m:ctrlPr>
+                    <w:rPr>
+                      <w:rFonts w:ascii="Cambria Math" w:hAnsi="Cambria Math"/>
+                      <w:i/>
+                    </w:rPr>
+                  </m:ctrlPr>
+                </m:dPr>
+                <m:e>
+                  <m:r>
+                    <w:rPr>
+                      <w:rFonts w:ascii="Cambria Math" w:hAnsi="Cambria Math"/>
+                    </w:rPr>
+                    <m:t>x × a</m:t>
+                  </m:r>
+                </m:e>
+              </m:d>
+              <m:r>
+                <w:rPr>
+                  <w:rFonts w:ascii="Cambria Math" w:hAnsi="Cambria Math"/>
+                </w:rPr>
+                <m:t xml:space="preserve"> + a</m:t>
+              </m:r>
+            </m:e>
+          </m:d>
         </m:oMath>
       </m:oMathPara>
     </w:p>

</xml_diff>

<commit_message>
Exponential of Delta Exponent Variable | (00:57 (W.I.B [Waktu Indonesia bagian Barat]), 01/04/2026), Batam, Kepulauan Riau, Indonesia | Exponential of Delta Exponent Variable #EXODUS14VERSES14 #PROVERBS11VERSES24 #LUCAS8VERSES24
Exponential of Delta Exponent Variable | (00:57 (W.I.B [Waktu Indonesia bagian Barat]), 01/04/2026), Batam, Kepulauan Riau, Indonesia | Exponential of Delta Exponent Variable #EXODUS14VERSES14 #PROVERBS11VERSES24 #LUCAS8VERSES24
</commit_message>
<xml_diff>
--- a/Exponential of Delta Exponent Variable.docx
+++ b/Exponential of Delta Exponent Variable.docx
@@ -465,1034 +465,7 @@
         <w:spacing w:line="360" w:lineRule="auto"/>
         <w:jc w:val="center"/>
         <w:rPr>
-          <w:rFonts w:ascii="Times New Roman" w:eastAsiaTheme="minorEastAsia" w:hAnsi="Times New Roman" w:cs="Times New Roman"/>
-          <w:sz w:val="24"/>
-          <w:szCs w:val="24"/>
-          <w:lang w:val="id-ID"/>
-        </w:rPr>
-      </w:pPr>
-    </w:p>
-    <w:p>
-      <w:pPr>
-        <w:spacing w:line="360" w:lineRule="auto"/>
-        <w:jc w:val="center"/>
-        <w:rPr>
           <w:rFonts w:eastAsiaTheme="minorEastAsia"/>
-        </w:rPr>
-      </w:pPr>
-      <m:oMathPara>
-        <m:oMathParaPr>
-          <m:jc m:val="center"/>
-        </m:oMathParaPr>
-        <m:oMath>
-          <m:nary>
-            <m:naryPr>
-              <m:chr m:val="∑"/>
-              <m:limLoc m:val="undOvr"/>
-              <m:ctrlPr>
-                <w:rPr>
-                  <w:rFonts w:ascii="Cambria Math" w:eastAsiaTheme="minorEastAsia" w:hAnsi="Cambria Math" w:cs="Times New Roman"/>
-                  <w:i/>
-                </w:rPr>
-              </m:ctrlPr>
-            </m:naryPr>
-            <m:sub>
-              <m:d>
-                <m:dPr>
-                  <m:ctrlPr>
-                    <w:rPr>
-                      <w:rFonts w:ascii="Cambria Math" w:eastAsiaTheme="minorEastAsia" w:hAnsi="Cambria Math" w:cs="Times New Roman"/>
-                      <w:i/>
-                    </w:rPr>
-                  </m:ctrlPr>
-                </m:dPr>
-                <m:e>
-                  <m:r>
-                    <w:rPr>
-                      <w:rFonts w:ascii="Cambria Math" w:eastAsiaTheme="minorEastAsia" w:hAnsi="Cambria Math" w:cs="Times New Roman"/>
-                    </w:rPr>
-                    <m:t>x + 1</m:t>
-                  </m:r>
-                </m:e>
-              </m:d>
-            </m:sub>
-            <m:sup>
-              <m:d>
-                <m:dPr>
-                  <m:ctrlPr>
-                    <w:rPr>
-                      <w:rFonts w:ascii="Cambria Math" w:eastAsiaTheme="minorEastAsia" w:hAnsi="Cambria Math" w:cs="Times New Roman"/>
-                      <w:i/>
-                    </w:rPr>
-                  </m:ctrlPr>
-                </m:dPr>
-                <m:e>
-                  <m:r>
-                    <w:rPr>
-                      <w:rFonts w:ascii="Cambria Math" w:eastAsiaTheme="minorEastAsia" w:hAnsi="Cambria Math" w:cs="Times New Roman"/>
-                    </w:rPr>
-                    <m:t>n → ∞</m:t>
-                  </m:r>
-                </m:e>
-              </m:d>
-            </m:sup>
-            <m:e>
-              <m:d>
-                <m:dPr>
-                  <m:ctrlPr>
-                    <w:rPr>
-                      <w:rFonts w:ascii="Cambria Math" w:eastAsiaTheme="minorEastAsia" w:hAnsi="Cambria Math" w:cs="Times New Roman"/>
-                      <w:i/>
-                    </w:rPr>
-                  </m:ctrlPr>
-                </m:dPr>
-                <m:e>
-                  <m:sSup>
-                    <m:sSupPr>
-                      <m:ctrlPr>
-                        <w:rPr>
-                          <w:rFonts w:ascii="Cambria Math" w:hAnsi="Cambria Math"/>
-                          <w:i/>
-                        </w:rPr>
-                      </m:ctrlPr>
-                    </m:sSupPr>
-                    <m:e>
-                      <m:d>
-                        <m:dPr>
-                          <m:ctrlPr>
-                            <w:rPr>
-                              <w:rFonts w:ascii="Cambria Math" w:hAnsi="Cambria Math"/>
-                              <w:i/>
-                            </w:rPr>
-                          </m:ctrlPr>
-                        </m:dPr>
-                        <m:e>
-                          <m:r>
-                            <w:rPr>
-                              <w:rFonts w:ascii="Cambria Math" w:hAnsi="Cambria Math"/>
-                            </w:rPr>
-                            <m:t>x + 1</m:t>
-                          </m:r>
-                        </m:e>
-                      </m:d>
-                    </m:e>
-                    <m:sup>
-                      <m:r>
-                        <w:rPr>
-                          <w:rFonts w:ascii="Cambria Math" w:hAnsi="Cambria Math"/>
-                        </w:rPr>
-                        <m:t>n</m:t>
-                      </m:r>
-                    </m:sup>
-                  </m:sSup>
-                  <m:r>
-                    <w:rPr>
-                      <w:rFonts w:ascii="Cambria Math" w:hAnsi="Cambria Math"/>
-                    </w:rPr>
-                    <m:t xml:space="preserve"> - </m:t>
-                  </m:r>
-                  <m:sSup>
-                    <m:sSupPr>
-                      <m:ctrlPr>
-                        <w:rPr>
-                          <w:rFonts w:ascii="Cambria Math" w:eastAsiaTheme="minorEastAsia" w:hAnsi="Cambria Math" w:cs="Times New Roman"/>
-                          <w:i/>
-                        </w:rPr>
-                      </m:ctrlPr>
-                    </m:sSupPr>
-                    <m:e>
-                      <m:r>
-                        <w:rPr>
-                          <w:rFonts w:ascii="Cambria Math" w:eastAsiaTheme="minorEastAsia" w:hAnsi="Cambria Math" w:cs="Times New Roman"/>
-                        </w:rPr>
-                        <m:t>x</m:t>
-                      </m:r>
-                    </m:e>
-                    <m:sup>
-                      <m:r>
-                        <w:rPr>
-                          <w:rFonts w:ascii="Cambria Math" w:eastAsiaTheme="minorEastAsia" w:hAnsi="Cambria Math" w:cs="Times New Roman"/>
-                        </w:rPr>
-                        <m:t>n</m:t>
-                      </m:r>
-                    </m:sup>
-                  </m:sSup>
-                </m:e>
-              </m:d>
-            </m:e>
-          </m:nary>
-          <m:r>
-            <w:rPr>
-              <w:rFonts w:ascii="Cambria Math" w:hAnsi="Cambria Math"/>
-            </w:rPr>
-            <m:t xml:space="preserve"> = </m:t>
-          </m:r>
-          <m:nary>
-            <m:naryPr>
-              <m:chr m:val="∑"/>
-              <m:limLoc m:val="undOvr"/>
-              <m:supHide m:val="1"/>
-              <m:ctrlPr>
-                <w:rPr>
-                  <w:rFonts w:ascii="Cambria Math" w:hAnsi="Cambria Math"/>
-                  <w:i/>
-                </w:rPr>
-              </m:ctrlPr>
-            </m:naryPr>
-            <m:sub>
-              <m:d>
-                <m:dPr>
-                  <m:ctrlPr>
-                    <w:rPr>
-                      <w:rFonts w:ascii="Cambria Math" w:hAnsi="Cambria Math"/>
-                      <w:i/>
-                    </w:rPr>
-                  </m:ctrlPr>
-                </m:dPr>
-                <m:e>
-                  <m:r>
-                    <w:rPr>
-                      <w:rFonts w:ascii="Cambria Math" w:hAnsi="Cambria Math"/>
-                    </w:rPr>
-                    <m:t>x + 1</m:t>
-                  </m:r>
-                </m:e>
-              </m:d>
-            </m:sub>
-            <m:sup/>
-            <m:e>
-              <m:d>
-                <m:dPr>
-                  <m:ctrlPr>
-                    <w:rPr>
-                      <w:rFonts w:ascii="Cambria Math" w:hAnsi="Cambria Math"/>
-                      <w:i/>
-                    </w:rPr>
-                  </m:ctrlPr>
-                </m:dPr>
-                <m:e>
-                  <m:d>
-                    <m:dPr>
-                      <m:ctrlPr>
-                        <w:rPr>
-                          <w:rFonts w:ascii="Cambria Math" w:hAnsi="Cambria Math"/>
-                          <w:i/>
-                        </w:rPr>
-                      </m:ctrlPr>
-                    </m:dPr>
-                    <m:e>
-                      <m:r>
-                        <w:rPr>
-                          <w:rFonts w:ascii="Cambria Math" w:hAnsi="Cambria Math"/>
-                        </w:rPr>
-                        <m:t>2 × x</m:t>
-                      </m:r>
-                    </m:e>
-                  </m:d>
-                  <m:r>
-                    <w:rPr>
-                      <w:rFonts w:ascii="Cambria Math" w:hAnsi="Cambria Math"/>
-                    </w:rPr>
-                    <m:t xml:space="preserve"> + 1</m:t>
-                  </m:r>
-                </m:e>
-              </m:d>
-            </m:e>
-          </m:nary>
-        </m:oMath>
-      </m:oMathPara>
-    </w:p>
-    <w:p>
-      <w:pPr>
-        <w:spacing w:line="360" w:lineRule="auto"/>
-        <w:jc w:val="center"/>
-        <w:rPr>
-          <w:rFonts w:ascii="Times New Roman" w:eastAsiaTheme="minorEastAsia" w:hAnsi="Times New Roman" w:cs="Times New Roman"/>
-          <w:sz w:val="24"/>
-          <w:szCs w:val="24"/>
-          <w:lang w:val="id-ID"/>
-        </w:rPr>
-      </w:pPr>
-    </w:p>
-    <w:p>
-      <w:pPr>
-        <w:spacing w:line="360" w:lineRule="auto"/>
-        <w:jc w:val="center"/>
-        <w:rPr>
-          <w:rFonts w:eastAsiaTheme="minorEastAsia"/>
-        </w:rPr>
-      </w:pPr>
-      <m:oMathPara>
-        <m:oMathParaPr>
-          <m:jc m:val="center"/>
-        </m:oMathParaPr>
-        <m:oMath>
-          <m:nary>
-            <m:naryPr>
-              <m:chr m:val="∑"/>
-              <m:limLoc m:val="undOvr"/>
-              <m:ctrlPr>
-                <w:rPr>
-                  <w:rFonts w:ascii="Cambria Math" w:eastAsiaTheme="minorEastAsia" w:hAnsi="Cambria Math" w:cs="Times New Roman"/>
-                  <w:i/>
-                </w:rPr>
-              </m:ctrlPr>
-            </m:naryPr>
-            <m:sub>
-              <m:d>
-                <m:dPr>
-                  <m:ctrlPr>
-                    <w:rPr>
-                      <w:rFonts w:ascii="Cambria Math" w:eastAsiaTheme="minorEastAsia" w:hAnsi="Cambria Math" w:cs="Times New Roman"/>
-                      <w:i/>
-                    </w:rPr>
-                  </m:ctrlPr>
-                </m:dPr>
-                <m:e>
-                  <m:r>
-                    <w:rPr>
-                      <w:rFonts w:ascii="Cambria Math" w:eastAsiaTheme="minorEastAsia" w:hAnsi="Cambria Math" w:cs="Times New Roman"/>
-                    </w:rPr>
-                    <m:t>x + a</m:t>
-                  </m:r>
-                </m:e>
-              </m:d>
-            </m:sub>
-            <m:sup>
-              <m:d>
-                <m:dPr>
-                  <m:ctrlPr>
-                    <w:rPr>
-                      <w:rFonts w:ascii="Cambria Math" w:eastAsiaTheme="minorEastAsia" w:hAnsi="Cambria Math" w:cs="Times New Roman"/>
-                      <w:i/>
-                    </w:rPr>
-                  </m:ctrlPr>
-                </m:dPr>
-                <m:e>
-                  <m:r>
-                    <w:rPr>
-                      <w:rFonts w:ascii="Cambria Math" w:eastAsiaTheme="minorEastAsia" w:hAnsi="Cambria Math" w:cs="Times New Roman"/>
-                    </w:rPr>
-                    <m:t>n → ∞</m:t>
-                  </m:r>
-                </m:e>
-              </m:d>
-            </m:sup>
-            <m:e>
-              <m:d>
-                <m:dPr>
-                  <m:ctrlPr>
-                    <w:rPr>
-                      <w:rFonts w:ascii="Cambria Math" w:eastAsiaTheme="minorEastAsia" w:hAnsi="Cambria Math" w:cs="Times New Roman"/>
-                      <w:i/>
-                    </w:rPr>
-                  </m:ctrlPr>
-                </m:dPr>
-                <m:e>
-                  <m:sSup>
-                    <m:sSupPr>
-                      <m:ctrlPr>
-                        <w:rPr>
-                          <w:rFonts w:ascii="Cambria Math" w:hAnsi="Cambria Math"/>
-                          <w:i/>
-                        </w:rPr>
-                      </m:ctrlPr>
-                    </m:sSupPr>
-                    <m:e>
-                      <m:d>
-                        <m:dPr>
-                          <m:ctrlPr>
-                            <w:rPr>
-                              <w:rFonts w:ascii="Cambria Math" w:hAnsi="Cambria Math"/>
-                              <w:i/>
-                            </w:rPr>
-                          </m:ctrlPr>
-                        </m:dPr>
-                        <m:e>
-                          <m:r>
-                            <w:rPr>
-                              <w:rFonts w:ascii="Cambria Math" w:hAnsi="Cambria Math"/>
-                            </w:rPr>
-                            <m:t>x + a</m:t>
-                          </m:r>
-                        </m:e>
-                      </m:d>
-                    </m:e>
-                    <m:sup>
-                      <m:r>
-                        <w:rPr>
-                          <w:rFonts w:ascii="Cambria Math" w:hAnsi="Cambria Math"/>
-                        </w:rPr>
-                        <m:t>n</m:t>
-                      </m:r>
-                    </m:sup>
-                  </m:sSup>
-                  <m:r>
-                    <w:rPr>
-                      <w:rFonts w:ascii="Cambria Math" w:hAnsi="Cambria Math"/>
-                    </w:rPr>
-                    <m:t xml:space="preserve"> - </m:t>
-                  </m:r>
-                  <m:sSup>
-                    <m:sSupPr>
-                      <m:ctrlPr>
-                        <w:rPr>
-                          <w:rFonts w:ascii="Cambria Math" w:eastAsiaTheme="minorEastAsia" w:hAnsi="Cambria Math" w:cs="Times New Roman"/>
-                          <w:i/>
-                        </w:rPr>
-                      </m:ctrlPr>
-                    </m:sSupPr>
-                    <m:e>
-                      <m:r>
-                        <w:rPr>
-                          <w:rFonts w:ascii="Cambria Math" w:eastAsiaTheme="minorEastAsia" w:hAnsi="Cambria Math" w:cs="Times New Roman"/>
-                        </w:rPr>
-                        <m:t>x</m:t>
-                      </m:r>
-                    </m:e>
-                    <m:sup>
-                      <m:r>
-                        <w:rPr>
-                          <w:rFonts w:ascii="Cambria Math" w:eastAsiaTheme="minorEastAsia" w:hAnsi="Cambria Math" w:cs="Times New Roman"/>
-                        </w:rPr>
-                        <m:t>n</m:t>
-                      </m:r>
-                    </m:sup>
-                  </m:sSup>
-                </m:e>
-              </m:d>
-            </m:e>
-          </m:nary>
-          <m:r>
-            <w:rPr>
-              <w:rFonts w:ascii="Cambria Math" w:hAnsi="Cambria Math"/>
-            </w:rPr>
-            <m:t xml:space="preserve"> = </m:t>
-          </m:r>
-          <m:nary>
-            <m:naryPr>
-              <m:chr m:val="∑"/>
-              <m:limLoc m:val="undOvr"/>
-              <m:supHide m:val="1"/>
-              <m:ctrlPr>
-                <w:rPr>
-                  <w:rFonts w:ascii="Cambria Math" w:hAnsi="Cambria Math"/>
-                  <w:i/>
-                </w:rPr>
-              </m:ctrlPr>
-            </m:naryPr>
-            <m:sub>
-              <m:d>
-                <m:dPr>
-                  <m:ctrlPr>
-                    <w:rPr>
-                      <w:rFonts w:ascii="Cambria Math" w:hAnsi="Cambria Math"/>
-                      <w:i/>
-                    </w:rPr>
-                  </m:ctrlPr>
-                </m:dPr>
-                <m:e>
-                  <m:r>
-                    <w:rPr>
-                      <w:rFonts w:ascii="Cambria Math" w:hAnsi="Cambria Math"/>
-                    </w:rPr>
-                    <m:t>x + a</m:t>
-                  </m:r>
-                </m:e>
-              </m:d>
-            </m:sub>
-            <m:sup/>
-            <m:e>
-              <m:d>
-                <m:dPr>
-                  <m:begChr m:val="{"/>
-                  <m:endChr m:val="}"/>
-                  <m:ctrlPr>
-                    <w:rPr>
-                      <w:rFonts w:ascii="Cambria Math" w:hAnsi="Cambria Math"/>
-                      <w:i/>
-                    </w:rPr>
-                  </m:ctrlPr>
-                </m:dPr>
-                <m:e>
-                  <m:d>
-                    <m:dPr>
-                      <m:ctrlPr>
-                        <w:rPr>
-                          <w:rFonts w:ascii="Cambria Math" w:hAnsi="Cambria Math"/>
-                          <w:i/>
-                        </w:rPr>
-                      </m:ctrlPr>
-                    </m:dPr>
-                    <m:e>
-                      <m:r>
-                        <w:rPr>
-                          <w:rFonts w:ascii="Cambria Math" w:hAnsi="Cambria Math"/>
-                        </w:rPr>
-                        <m:t>x × a</m:t>
-                      </m:r>
-                    </m:e>
-                  </m:d>
-                  <m:r>
-                    <w:rPr>
-                      <w:rFonts w:ascii="Cambria Math" w:hAnsi="Cambria Math"/>
-                    </w:rPr>
-                    <m:t>+ a</m:t>
-                  </m:r>
-                </m:e>
-              </m:d>
-            </m:e>
-          </m:nary>
-        </m:oMath>
-      </m:oMathPara>
-    </w:p>
-    <w:p>
-      <w:pPr>
-        <w:spacing w:line="360" w:lineRule="auto"/>
-        <w:jc w:val="center"/>
-        <w:rPr>
-          <w:rFonts w:ascii="Times New Roman" w:eastAsiaTheme="minorEastAsia" w:hAnsi="Times New Roman" w:cs="Times New Roman"/>
-          <w:sz w:val="24"/>
-          <w:szCs w:val="24"/>
-          <w:lang w:val="id-ID"/>
-        </w:rPr>
-      </w:pPr>
-    </w:p>
-    <w:p>
-      <w:pPr>
-        <w:spacing w:line="360" w:lineRule="auto"/>
-        <w:jc w:val="center"/>
-        <w:rPr>
-          <w:rFonts w:eastAsiaTheme="minorEastAsia"/>
-        </w:rPr>
-      </w:pPr>
-      <m:oMathPara>
-        <m:oMathParaPr>
-          <m:jc m:val="center"/>
-        </m:oMathParaPr>
-        <m:oMath>
-          <m:nary>
-            <m:naryPr>
-              <m:chr m:val="∑"/>
-              <m:limLoc m:val="undOvr"/>
-              <m:ctrlPr>
-                <w:rPr>
-                  <w:rFonts w:ascii="Cambria Math" w:eastAsiaTheme="minorEastAsia" w:hAnsi="Cambria Math" w:cs="Times New Roman"/>
-                  <w:i/>
-                </w:rPr>
-              </m:ctrlPr>
-            </m:naryPr>
-            <m:sub>
-              <m:d>
-                <m:dPr>
-                  <m:ctrlPr>
-                    <w:rPr>
-                      <w:rFonts w:ascii="Cambria Math" w:eastAsiaTheme="minorEastAsia" w:hAnsi="Cambria Math" w:cs="Times New Roman"/>
-                      <w:i/>
-                    </w:rPr>
-                  </m:ctrlPr>
-                </m:dPr>
-                <m:e>
-                  <m:r>
-                    <w:rPr>
-                      <w:rFonts w:ascii="Cambria Math" w:eastAsiaTheme="minorEastAsia" w:hAnsi="Cambria Math" w:cs="Times New Roman"/>
-                    </w:rPr>
-                    <m:t>x + a</m:t>
-                  </m:r>
-                </m:e>
-              </m:d>
-            </m:sub>
-            <m:sup>
-              <m:d>
-                <m:dPr>
-                  <m:ctrlPr>
-                    <w:rPr>
-                      <w:rFonts w:ascii="Cambria Math" w:eastAsiaTheme="minorEastAsia" w:hAnsi="Cambria Math" w:cs="Times New Roman"/>
-                      <w:i/>
-                    </w:rPr>
-                  </m:ctrlPr>
-                </m:dPr>
-                <m:e>
-                  <m:r>
-                    <w:rPr>
-                      <w:rFonts w:ascii="Cambria Math" w:eastAsiaTheme="minorEastAsia" w:hAnsi="Cambria Math" w:cs="Times New Roman"/>
-                    </w:rPr>
-                    <m:t>n → ∞</m:t>
-                  </m:r>
-                </m:e>
-              </m:d>
-            </m:sup>
-            <m:e>
-              <m:d>
-                <m:dPr>
-                  <m:ctrlPr>
-                    <w:rPr>
-                      <w:rFonts w:ascii="Cambria Math" w:eastAsiaTheme="minorEastAsia" w:hAnsi="Cambria Math" w:cs="Times New Roman"/>
-                      <w:i/>
-                    </w:rPr>
-                  </m:ctrlPr>
-                </m:dPr>
-                <m:e>
-                  <m:sSup>
-                    <m:sSupPr>
-                      <m:ctrlPr>
-                        <w:rPr>
-                          <w:rFonts w:ascii="Cambria Math" w:hAnsi="Cambria Math"/>
-                          <w:i/>
-                        </w:rPr>
-                      </m:ctrlPr>
-                    </m:sSupPr>
-                    <m:e>
-                      <m:d>
-                        <m:dPr>
-                          <m:ctrlPr>
-                            <w:rPr>
-                              <w:rFonts w:ascii="Cambria Math" w:hAnsi="Cambria Math"/>
-                              <w:i/>
-                            </w:rPr>
-                          </m:ctrlPr>
-                        </m:dPr>
-                        <m:e>
-                          <m:r>
-                            <w:rPr>
-                              <w:rFonts w:ascii="Cambria Math" w:hAnsi="Cambria Math"/>
-                            </w:rPr>
-                            <m:t>x + a</m:t>
-                          </m:r>
-                        </m:e>
-                      </m:d>
-                    </m:e>
-                    <m:sup>
-                      <m:r>
-                        <w:rPr>
-                          <w:rFonts w:ascii="Cambria Math" w:hAnsi="Cambria Math"/>
-                        </w:rPr>
-                        <m:t>n</m:t>
-                      </m:r>
-                    </m:sup>
-                  </m:sSup>
-                  <m:r>
-                    <w:rPr>
-                      <w:rFonts w:ascii="Cambria Math" w:hAnsi="Cambria Math"/>
-                    </w:rPr>
-                    <m:t xml:space="preserve"> - </m:t>
-                  </m:r>
-                  <m:sSup>
-                    <m:sSupPr>
-                      <m:ctrlPr>
-                        <w:rPr>
-                          <w:rFonts w:ascii="Cambria Math" w:eastAsiaTheme="minorEastAsia" w:hAnsi="Cambria Math" w:cs="Times New Roman"/>
-                          <w:i/>
-                        </w:rPr>
-                      </m:ctrlPr>
-                    </m:sSupPr>
-                    <m:e>
-                      <m:r>
-                        <w:rPr>
-                          <w:rFonts w:ascii="Cambria Math" w:eastAsiaTheme="minorEastAsia" w:hAnsi="Cambria Math" w:cs="Times New Roman"/>
-                        </w:rPr>
-                        <m:t>x</m:t>
-                      </m:r>
-                    </m:e>
-                    <m:sup>
-                      <m:r>
-                        <w:rPr>
-                          <w:rFonts w:ascii="Cambria Math" w:eastAsiaTheme="minorEastAsia" w:hAnsi="Cambria Math" w:cs="Times New Roman"/>
-                        </w:rPr>
-                        <m:t>n</m:t>
-                      </m:r>
-                    </m:sup>
-                  </m:sSup>
-                </m:e>
-              </m:d>
-            </m:e>
-          </m:nary>
-          <m:r>
-            <w:rPr>
-              <w:rFonts w:ascii="Cambria Math" w:hAnsi="Cambria Math"/>
-            </w:rPr>
-            <m:t xml:space="preserve"> = </m:t>
-          </m:r>
-          <m:nary>
-            <m:naryPr>
-              <m:chr m:val="∑"/>
-              <m:limLoc m:val="undOvr"/>
-              <m:supHide m:val="1"/>
-              <m:ctrlPr>
-                <w:rPr>
-                  <w:rFonts w:ascii="Cambria Math" w:hAnsi="Cambria Math"/>
-                  <w:i/>
-                </w:rPr>
-              </m:ctrlPr>
-            </m:naryPr>
-            <m:sub>
-              <m:d>
-                <m:dPr>
-                  <m:ctrlPr>
-                    <w:rPr>
-                      <w:rFonts w:ascii="Cambria Math" w:eastAsiaTheme="minorEastAsia" w:hAnsi="Cambria Math" w:cs="Times New Roman"/>
-                      <w:i/>
-                    </w:rPr>
-                  </m:ctrlPr>
-                </m:dPr>
-                <m:e>
-                  <m:r>
-                    <w:rPr>
-                      <w:rFonts w:ascii="Cambria Math" w:eastAsiaTheme="minorEastAsia" w:hAnsi="Cambria Math" w:cs="Times New Roman"/>
-                    </w:rPr>
-                    <m:t>x + a</m:t>
-                  </m:r>
-                </m:e>
-              </m:d>
-            </m:sub>
-            <m:sup/>
-            <m:e>
-              <m:d>
-                <m:dPr>
-                  <m:ctrlPr>
-                    <w:rPr>
-                      <w:rFonts w:ascii="Cambria Math" w:hAnsi="Cambria Math"/>
-                      <w:i/>
-                    </w:rPr>
-                  </m:ctrlPr>
-                </m:dPr>
-                <m:e>
-                  <m:d>
-                    <m:dPr>
-                      <m:begChr m:val="{"/>
-                      <m:endChr m:val="}"/>
-                      <m:ctrlPr>
-                        <w:rPr>
-                          <w:rFonts w:ascii="Cambria Math" w:hAnsi="Cambria Math"/>
-                          <w:i/>
-                        </w:rPr>
-                      </m:ctrlPr>
-                    </m:dPr>
-                    <m:e>
-                      <m:d>
-                        <m:dPr>
-                          <m:ctrlPr>
-                            <w:rPr>
-                              <w:rFonts w:ascii="Cambria Math" w:hAnsi="Cambria Math"/>
-                              <w:i/>
-                            </w:rPr>
-                          </m:ctrlPr>
-                        </m:dPr>
-                        <m:e>
-                          <m:r>
-                            <w:rPr>
-                              <w:rFonts w:ascii="Cambria Math" w:hAnsi="Cambria Math"/>
-                            </w:rPr>
-                            <m:t>x + a</m:t>
-                          </m:r>
-                        </m:e>
-                      </m:d>
-                      <m:r>
-                        <w:rPr>
-                          <w:rFonts w:ascii="Cambria Math" w:hAnsi="Cambria Math"/>
-                        </w:rPr>
-                        <m:t xml:space="preserve"> × a</m:t>
-                      </m:r>
-                    </m:e>
-                  </m:d>
-                  <m:r>
-                    <w:rPr>
-                      <w:rFonts w:ascii="Cambria Math" w:hAnsi="Cambria Math"/>
-                    </w:rPr>
-                    <m:t xml:space="preserve"> + a</m:t>
-                  </m:r>
-                </m:e>
-              </m:d>
-            </m:e>
-          </m:nary>
-        </m:oMath>
-      </m:oMathPara>
-    </w:p>
-    <w:p>
-      <w:pPr>
-        <w:spacing w:line="360" w:lineRule="auto"/>
-        <w:jc w:val="center"/>
-        <w:rPr>
-          <w:rFonts w:ascii="Times New Roman" w:eastAsiaTheme="minorEastAsia" w:hAnsi="Times New Roman" w:cs="Times New Roman"/>
-          <w:sz w:val="24"/>
-          <w:szCs w:val="24"/>
-          <w:lang w:val="id-ID"/>
-        </w:rPr>
-      </w:pPr>
-    </w:p>
-    <w:p>
-      <w:pPr>
-        <w:spacing w:line="360" w:lineRule="auto"/>
-        <w:jc w:val="center"/>
-        <w:rPr>
-          <w:rFonts w:eastAsiaTheme="minorEastAsia"/>
-        </w:rPr>
-      </w:pPr>
-      <m:oMathPara>
-        <m:oMathParaPr>
-          <m:jc m:val="center"/>
-        </m:oMathParaPr>
-        <m:oMath>
-          <m:nary>
-            <m:naryPr>
-              <m:chr m:val="∑"/>
-              <m:limLoc m:val="undOvr"/>
-              <m:ctrlPr>
-                <w:rPr>
-                  <w:rFonts w:ascii="Cambria Math" w:eastAsiaTheme="minorEastAsia" w:hAnsi="Cambria Math" w:cs="Times New Roman"/>
-                  <w:i/>
-                </w:rPr>
-              </m:ctrlPr>
-            </m:naryPr>
-            <m:sub>
-              <m:d>
-                <m:dPr>
-                  <m:ctrlPr>
-                    <w:rPr>
-                      <w:rFonts w:ascii="Cambria Math" w:eastAsiaTheme="minorEastAsia" w:hAnsi="Cambria Math" w:cs="Times New Roman"/>
-                      <w:i/>
-                    </w:rPr>
-                  </m:ctrlPr>
-                </m:dPr>
-                <m:e>
-                  <m:r>
-                    <w:rPr>
-                      <w:rFonts w:ascii="Cambria Math" w:eastAsiaTheme="minorEastAsia" w:hAnsi="Cambria Math" w:cs="Times New Roman"/>
-                    </w:rPr>
-                    <m:t>x + a</m:t>
-                  </m:r>
-                </m:e>
-              </m:d>
-            </m:sub>
-            <m:sup>
-              <m:d>
-                <m:dPr>
-                  <m:ctrlPr>
-                    <w:rPr>
-                      <w:rFonts w:ascii="Cambria Math" w:eastAsiaTheme="minorEastAsia" w:hAnsi="Cambria Math" w:cs="Times New Roman"/>
-                      <w:i/>
-                    </w:rPr>
-                  </m:ctrlPr>
-                </m:dPr>
-                <m:e>
-                  <m:r>
-                    <w:rPr>
-                      <w:rFonts w:ascii="Cambria Math" w:eastAsiaTheme="minorEastAsia" w:hAnsi="Cambria Math" w:cs="Times New Roman"/>
-                    </w:rPr>
-                    <m:t>n → ∞</m:t>
-                  </m:r>
-                </m:e>
-              </m:d>
-            </m:sup>
-            <m:e>
-              <w:bookmarkStart w:id="0" w:name="_Hlk225859689"/>
-              <m:d>
-                <m:dPr>
-                  <m:ctrlPr>
-                    <w:rPr>
-                      <w:rFonts w:ascii="Cambria Math" w:eastAsiaTheme="minorEastAsia" w:hAnsi="Cambria Math" w:cs="Times New Roman"/>
-                      <w:i/>
-                    </w:rPr>
-                  </m:ctrlPr>
-                </m:dPr>
-                <m:e>
-                  <m:sSup>
-                    <m:sSupPr>
-                      <m:ctrlPr>
-                        <w:rPr>
-                          <w:rFonts w:ascii="Cambria Math" w:hAnsi="Cambria Math"/>
-                          <w:i/>
-                        </w:rPr>
-                      </m:ctrlPr>
-                    </m:sSupPr>
-                    <m:e>
-                      <m:d>
-                        <m:dPr>
-                          <m:ctrlPr>
-                            <w:rPr>
-                              <w:rFonts w:ascii="Cambria Math" w:hAnsi="Cambria Math"/>
-                              <w:i/>
-                            </w:rPr>
-                          </m:ctrlPr>
-                        </m:dPr>
-                        <m:e>
-                          <m:r>
-                            <w:rPr>
-                              <w:rFonts w:ascii="Cambria Math" w:hAnsi="Cambria Math"/>
-                            </w:rPr>
-                            <m:t>x + a</m:t>
-                          </m:r>
-                        </m:e>
-                      </m:d>
-                    </m:e>
-                    <m:sup>
-                      <m:r>
-                        <w:rPr>
-                          <w:rFonts w:ascii="Cambria Math" w:hAnsi="Cambria Math"/>
-                        </w:rPr>
-                        <m:t>n</m:t>
-                      </m:r>
-                    </m:sup>
-                  </m:sSup>
-                  <m:r>
-                    <w:rPr>
-                      <w:rFonts w:ascii="Cambria Math" w:hAnsi="Cambria Math"/>
-                    </w:rPr>
-                    <m:t xml:space="preserve"> - </m:t>
-                  </m:r>
-                  <m:sSup>
-                    <m:sSupPr>
-                      <m:ctrlPr>
-                        <w:rPr>
-                          <w:rFonts w:ascii="Cambria Math" w:eastAsiaTheme="minorEastAsia" w:hAnsi="Cambria Math" w:cs="Times New Roman"/>
-                          <w:i/>
-                        </w:rPr>
-                      </m:ctrlPr>
-                    </m:sSupPr>
-                    <m:e>
-                      <m:r>
-                        <w:rPr>
-                          <w:rFonts w:ascii="Cambria Math" w:eastAsiaTheme="minorEastAsia" w:hAnsi="Cambria Math" w:cs="Times New Roman"/>
-                        </w:rPr>
-                        <m:t>x</m:t>
-                      </m:r>
-                    </m:e>
-                    <m:sup>
-                      <m:r>
-                        <w:rPr>
-                          <w:rFonts w:ascii="Cambria Math" w:eastAsiaTheme="minorEastAsia" w:hAnsi="Cambria Math" w:cs="Times New Roman"/>
-                        </w:rPr>
-                        <m:t>n</m:t>
-                      </m:r>
-                    </m:sup>
-                  </m:sSup>
-                </m:e>
-              </m:d>
-              <w:bookmarkEnd w:id="0"/>
-            </m:e>
-          </m:nary>
-          <m:r>
-            <w:rPr>
-              <w:rFonts w:ascii="Cambria Math" w:hAnsi="Cambria Math"/>
-            </w:rPr>
-            <m:t xml:space="preserve"> = </m:t>
-          </m:r>
-          <m:nary>
-            <m:naryPr>
-              <m:chr m:val="∑"/>
-              <m:limLoc m:val="undOvr"/>
-              <m:supHide m:val="1"/>
-              <m:ctrlPr>
-                <w:rPr>
-                  <w:rFonts w:ascii="Cambria Math" w:hAnsi="Cambria Math"/>
-                  <w:i/>
-                </w:rPr>
-              </m:ctrlPr>
-            </m:naryPr>
-            <m:sub>
-              <m:d>
-                <m:dPr>
-                  <m:ctrlPr>
-                    <w:rPr>
-                      <w:rFonts w:ascii="Cambria Math" w:eastAsiaTheme="minorEastAsia" w:hAnsi="Cambria Math" w:cs="Times New Roman"/>
-                      <w:i/>
-                    </w:rPr>
-                  </m:ctrlPr>
-                </m:dPr>
-                <m:e>
-                  <m:r>
-                    <w:rPr>
-                      <w:rFonts w:ascii="Cambria Math" w:eastAsiaTheme="minorEastAsia" w:hAnsi="Cambria Math" w:cs="Times New Roman"/>
-                    </w:rPr>
-                    <m:t>x + a</m:t>
-                  </m:r>
-                </m:e>
-              </m:d>
-            </m:sub>
-            <m:sup/>
-            <m:e>
-              <m:d>
-                <m:dPr>
-                  <m:ctrlPr>
-                    <w:rPr>
-                      <w:rFonts w:ascii="Cambria Math" w:hAnsi="Cambria Math"/>
-                      <w:i/>
-                    </w:rPr>
-                  </m:ctrlPr>
-                </m:dPr>
-                <m:e>
-                  <m:sSup>
-                    <m:sSupPr>
-                      <m:ctrlPr>
-                        <w:rPr>
-                          <w:rFonts w:ascii="Cambria Math" w:hAnsi="Cambria Math"/>
-                          <w:i/>
-                        </w:rPr>
-                      </m:ctrlPr>
-                    </m:sSupPr>
-                    <m:e>
-                      <m:r>
-                        <w:rPr>
-                          <w:rFonts w:ascii="Cambria Math" w:hAnsi="Cambria Math"/>
-                        </w:rPr>
-                        <m:t>a</m:t>
-                      </m:r>
-                    </m:e>
-                    <m:sup>
-                      <m:r>
-                        <w:rPr>
-                          <w:rFonts w:ascii="Cambria Math" w:hAnsi="Cambria Math"/>
-                        </w:rPr>
-                        <m:t>2</m:t>
-                      </m:r>
-                    </m:sup>
-                  </m:sSup>
-                  <m:r>
-                    <w:rPr>
-                      <w:rFonts w:ascii="Cambria Math" w:hAnsi="Cambria Math"/>
-                    </w:rPr>
-                    <m:t xml:space="preserve"> + </m:t>
-                  </m:r>
-                  <m:d>
-                    <m:dPr>
-                      <m:ctrlPr>
-                        <w:rPr>
-                          <w:rFonts w:ascii="Cambria Math" w:hAnsi="Cambria Math"/>
-                          <w:i/>
-                        </w:rPr>
-                      </m:ctrlPr>
-                    </m:dPr>
-                    <m:e>
-                      <m:r>
-                        <w:rPr>
-                          <w:rFonts w:ascii="Cambria Math" w:hAnsi="Cambria Math"/>
-                        </w:rPr>
-                        <m:t>x × a</m:t>
-                      </m:r>
-                    </m:e>
-                  </m:d>
-                  <m:r>
-                    <w:rPr>
-                      <w:rFonts w:ascii="Cambria Math" w:hAnsi="Cambria Math"/>
-                    </w:rPr>
-                    <m:t xml:space="preserve"> + a</m:t>
-                  </m:r>
-                </m:e>
-              </m:d>
-            </m:e>
-          </m:nary>
-        </m:oMath>
-      </m:oMathPara>
-    </w:p>
-    <w:p>
-      <w:pPr>
-        <w:spacing w:line="360" w:lineRule="auto"/>
-        <w:jc w:val="center"/>
-        <w:rPr>
-          <w:rFonts w:ascii="Times New Roman" w:eastAsiaTheme="minorEastAsia" w:hAnsi="Times New Roman" w:cs="Times New Roman"/>
-          <w:sz w:val="24"/>
-          <w:szCs w:val="24"/>
-          <w:lang w:val="id-ID"/>
         </w:rPr>
       </w:pPr>
     </w:p>
@@ -1659,6 +632,12 @@
                     <w:rPr>
                       <w:rFonts w:ascii="Cambria Math" w:hAnsi="Cambria Math"/>
                     </w:rPr>
+                    <m:t xml:space="preserve">2 × </m:t>
+                  </m:r>
+                  <m:r>
+                    <w:rPr>
+                      <w:rFonts w:ascii="Cambria Math" w:hAnsi="Cambria Math"/>
+                    </w:rPr>
                     <m:t>x × a</m:t>
                   </m:r>
                 </m:e>
@@ -1667,8 +646,40 @@
                 <w:rPr>
                   <w:rFonts w:ascii="Cambria Math" w:hAnsi="Cambria Math"/>
                 </w:rPr>
-                <m:t xml:space="preserve"> + a</m:t>
+                <m:t xml:space="preserve"> -</m:t>
               </m:r>
+              <m:r>
+                <w:rPr>
+                  <w:rFonts w:ascii="Cambria Math" w:hAnsi="Cambria Math"/>
+                </w:rPr>
+                <m:t xml:space="preserve"> </m:t>
+              </m:r>
+              <m:sSup>
+                <m:sSupPr>
+                  <m:ctrlPr>
+                    <w:rPr>
+                      <w:rFonts w:ascii="Cambria Math" w:hAnsi="Cambria Math"/>
+                      <w:i/>
+                    </w:rPr>
+                  </m:ctrlPr>
+                </m:sSupPr>
+                <m:e>
+                  <m:r>
+                    <w:rPr>
+                      <w:rFonts w:ascii="Cambria Math" w:hAnsi="Cambria Math"/>
+                    </w:rPr>
+                    <m:t>x</m:t>
+                  </m:r>
+                </m:e>
+                <m:sup>
+                  <m:r>
+                    <w:rPr>
+                      <w:rFonts w:ascii="Cambria Math" w:hAnsi="Cambria Math"/>
+                    </w:rPr>
+                    <m:t>2</m:t>
+                  </m:r>
+                </m:sup>
+              </m:sSup>
             </m:e>
           </m:d>
         </m:oMath>

</xml_diff>

<commit_message>
Exponential of Delta Exponent Variable | (13:38 (W.I.B [Waktu Indonesia bagian Barat]), 03/04/2026), Batam, Kepulauan Riau, Indonesia | Exponential of Delta Exponent Variable #EXODUS14VERSES14 #PROVERBS11VERSES24 #LUCAS8VERSES24
Exponential of Delta Exponent Variable | (13:38 (W.I.B [Waktu Indonesia bagian Barat]), 03/04/2026), Batam, Kepulauan Riau, Indonesia | Exponential of Delta Exponent Variable #EXODUS14VERSES14 #PROVERBS11VERSES24 #LUCAS8VERSES24
</commit_message>
<xml_diff>
--- a/Exponential of Delta Exponent Variable.docx
+++ b/Exponential of Delta Exponent Variable.docx
@@ -41,7 +41,6 @@
           <w:lang w:val="id-ID"/>
         </w:rPr>
       </w:pPr>
-      <w:proofErr w:type="spellStart"/>
       <w:r>
         <w:rPr>
           <w:rFonts w:ascii="Times New Roman" w:eastAsiaTheme="minorEastAsia" w:hAnsi="Times New Roman" w:cs="Times New Roman"/>
@@ -49,37 +48,7 @@
           <w:szCs w:val="24"/>
           <w:lang w:val="id-ID"/>
         </w:rPr>
-        <w:t>by</w:t>
-      </w:r>
-      <w:proofErr w:type="spellEnd"/>
-      <w:r>
-        <w:rPr>
-          <w:rFonts w:ascii="Times New Roman" w:eastAsiaTheme="minorEastAsia" w:hAnsi="Times New Roman" w:cs="Times New Roman"/>
-          <w:sz w:val="24"/>
-          <w:szCs w:val="24"/>
-          <w:lang w:val="id-ID"/>
-        </w:rPr>
-        <w:t xml:space="preserve"> : Samuel Hasiholan Omega Purba, S. </w:t>
-      </w:r>
-      <w:proofErr w:type="spellStart"/>
-      <w:r>
-        <w:rPr>
-          <w:rFonts w:ascii="Times New Roman" w:eastAsiaTheme="minorEastAsia" w:hAnsi="Times New Roman" w:cs="Times New Roman"/>
-          <w:sz w:val="24"/>
-          <w:szCs w:val="24"/>
-          <w:lang w:val="id-ID"/>
-        </w:rPr>
-        <w:t>Tr</w:t>
-      </w:r>
-      <w:proofErr w:type="spellEnd"/>
-      <w:r>
-        <w:rPr>
-          <w:rFonts w:ascii="Times New Roman" w:eastAsiaTheme="minorEastAsia" w:hAnsi="Times New Roman" w:cs="Times New Roman"/>
-          <w:sz w:val="24"/>
-          <w:szCs w:val="24"/>
-          <w:lang w:val="id-ID"/>
-        </w:rPr>
-        <w:t>. T.</w:t>
+        <w:t>by : Samuel Hasiholan Omega Purba, S. Tr. T.</w:t>
       </w:r>
     </w:p>
     <w:p>
@@ -114,7 +83,6 @@
           <w:lang w:val="id-ID"/>
         </w:rPr>
       </w:pPr>
-      <w:proofErr w:type="spellStart"/>
       <w:r>
         <w:rPr>
           <w:rFonts w:ascii="Times New Roman" w:eastAsiaTheme="minorEastAsia" w:hAnsi="Times New Roman" w:cs="Times New Roman"/>
@@ -122,17 +90,7 @@
           <w:szCs w:val="24"/>
           <w:lang w:val="id-ID"/>
         </w:rPr>
-        <w:t>Prodi</w:t>
-      </w:r>
-      <w:proofErr w:type="spellEnd"/>
-      <w:r>
-        <w:rPr>
-          <w:rFonts w:ascii="Times New Roman" w:eastAsiaTheme="minorEastAsia" w:hAnsi="Times New Roman" w:cs="Times New Roman"/>
-          <w:sz w:val="24"/>
-          <w:szCs w:val="24"/>
-          <w:lang w:val="id-ID"/>
-        </w:rPr>
-        <w:t xml:space="preserve"> Teknik Robotika dan Kecerdasan buatan</w:t>
+        <w:t>Prodi Teknik Robotika dan Kecerdasan buatan</w:t>
       </w:r>
     </w:p>
     <w:p>
@@ -269,42 +227,32 @@
             </w:rPr>
             <m:t xml:space="preserve"> = </m:t>
           </m:r>
-          <m:d>
-            <m:dPr>
+          <m:sSup>
+            <m:sSupPr>
               <m:ctrlPr>
                 <w:rPr>
                   <w:rFonts w:ascii="Cambria Math" w:hAnsi="Cambria Math"/>
                   <w:i/>
                 </w:rPr>
               </m:ctrlPr>
-            </m:dPr>
+            </m:sSupPr>
             <m:e>
               <m:r>
                 <w:rPr>
                   <w:rFonts w:ascii="Cambria Math" w:hAnsi="Cambria Math"/>
                 </w:rPr>
-                <m:t xml:space="preserve">x + </m:t>
+                <m:t>1</m:t>
               </m:r>
-              <m:d>
-                <m:dPr>
-                  <m:ctrlPr>
-                    <w:rPr>
-                      <w:rFonts w:ascii="Cambria Math" w:hAnsi="Cambria Math"/>
-                      <w:i/>
-                    </w:rPr>
-                  </m:ctrlPr>
-                </m:dPr>
-                <m:e>
-                  <m:r>
-                    <w:rPr>
-                      <w:rFonts w:ascii="Cambria Math" w:hAnsi="Cambria Math"/>
-                    </w:rPr>
-                    <m:t>x + 1</m:t>
-                  </m:r>
-                </m:e>
-              </m:d>
             </m:e>
-          </m:d>
+            <m:sup>
+              <m:r>
+                <w:rPr>
+                  <w:rFonts w:ascii="Cambria Math" w:hAnsi="Cambria Math"/>
+                </w:rPr>
+                <m:t>n</m:t>
+              </m:r>
+            </m:sup>
+          </m:sSup>
         </m:oMath>
       </m:oMathPara>
     </w:p>
@@ -329,9 +277,6 @@
         </w:rPr>
       </w:pPr>
       <m:oMathPara>
-        <m:oMathParaPr>
-          <m:jc m:val="center"/>
-        </m:oMathParaPr>
         <m:oMath>
           <m:d>
             <m:dPr>
@@ -367,7 +312,7 @@
                         <w:rPr>
                           <w:rFonts w:ascii="Cambria Math" w:hAnsi="Cambria Math"/>
                         </w:rPr>
-                        <m:t>x+1</m:t>
+                        <m:t>x + 1</m:t>
                       </m:r>
                     </m:e>
                   </m:d>
@@ -425,12 +370,44 @@
             <m:dPr>
               <m:ctrlPr>
                 <w:rPr>
-                  <w:rFonts w:ascii="Cambria Math" w:hAnsi="Cambria Math"/>
+                  <w:rFonts w:ascii="Cambria Math" w:eastAsiaTheme="minorEastAsia" w:hAnsi="Cambria Math" w:cs="Times New Roman"/>
                   <w:i/>
                 </w:rPr>
               </m:ctrlPr>
             </m:dPr>
             <m:e>
+              <m:sSup>
+                <m:sSupPr>
+                  <m:ctrlPr>
+                    <w:rPr>
+                      <w:rFonts w:ascii="Cambria Math" w:hAnsi="Cambria Math"/>
+                      <w:i/>
+                    </w:rPr>
+                  </m:ctrlPr>
+                </m:sSupPr>
+                <m:e>
+                  <m:r>
+                    <w:rPr>
+                      <w:rFonts w:ascii="Cambria Math" w:hAnsi="Cambria Math"/>
+                    </w:rPr>
+                    <m:t>1</m:t>
+                  </m:r>
+                </m:e>
+                <m:sup>
+                  <m:r>
+                    <w:rPr>
+                      <w:rFonts w:ascii="Cambria Math" w:hAnsi="Cambria Math"/>
+                    </w:rPr>
+                    <m:t>n</m:t>
+                  </m:r>
+                </m:sup>
+              </m:sSup>
+              <m:r>
+                <w:rPr>
+                  <w:rFonts w:ascii="Cambria Math" w:hAnsi="Cambria Math"/>
+                </w:rPr>
+                <m:t xml:space="preserve"> + </m:t>
+              </m:r>
               <m:d>
                 <m:dPr>
                   <m:ctrlPr>
@@ -445,7 +422,7 @@
                     <w:rPr>
                       <w:rFonts w:ascii="Cambria Math" w:hAnsi="Cambria Math"/>
                     </w:rPr>
-                    <m:t>2 × x</m:t>
+                    <m:t>2 × a × x</m:t>
                   </m:r>
                 </m:e>
               </m:d>
@@ -453,8 +430,34 @@
                 <w:rPr>
                   <w:rFonts w:ascii="Cambria Math" w:hAnsi="Cambria Math"/>
                 </w:rPr>
-                <m:t xml:space="preserve"> + 1</m:t>
+                <m:t xml:space="preserve"> - </m:t>
               </m:r>
+              <m:sSup>
+                <m:sSupPr>
+                  <m:ctrlPr>
+                    <w:rPr>
+                      <w:rFonts w:ascii="Cambria Math" w:eastAsiaTheme="minorEastAsia" w:hAnsi="Cambria Math" w:cs="Times New Roman"/>
+                      <w:i/>
+                    </w:rPr>
+                  </m:ctrlPr>
+                </m:sSupPr>
+                <m:e>
+                  <m:r>
+                    <w:rPr>
+                      <w:rFonts w:ascii="Cambria Math" w:eastAsiaTheme="minorEastAsia" w:hAnsi="Cambria Math" w:cs="Times New Roman"/>
+                    </w:rPr>
+                    <m:t>x</m:t>
+                  </m:r>
+                </m:e>
+                <m:sup>
+                  <m:r>
+                    <w:rPr>
+                      <w:rFonts w:ascii="Cambria Math" w:eastAsiaTheme="minorEastAsia" w:hAnsi="Cambria Math" w:cs="Times New Roman"/>
+                    </w:rPr>
+                    <m:t>n</m:t>
+                  </m:r>
+                </m:sup>
+              </m:sSup>
             </m:e>
           </m:d>
         </m:oMath>
@@ -465,7 +468,10 @@
         <w:spacing w:line="360" w:lineRule="auto"/>
         <w:jc w:val="center"/>
         <w:rPr>
-          <w:rFonts w:eastAsiaTheme="minorEastAsia"/>
+          <w:rFonts w:ascii="Times New Roman" w:eastAsiaTheme="minorEastAsia" w:hAnsi="Times New Roman" w:cs="Times New Roman"/>
+          <w:sz w:val="24"/>
+          <w:szCs w:val="24"/>
+          <w:lang w:val="id-ID"/>
         </w:rPr>
       </w:pPr>
     </w:p>
@@ -473,14 +479,8 @@
       <w:pPr>
         <w:spacing w:line="360" w:lineRule="auto"/>
         <w:jc w:val="center"/>
-        <w:rPr>
-          <w:rFonts w:eastAsiaTheme="minorEastAsia"/>
-        </w:rPr>
       </w:pPr>
       <m:oMathPara>
-        <m:oMathParaPr>
-          <m:jc m:val="center"/>
-        </m:oMathParaPr>
         <m:oMath>
           <m:d>
             <m:dPr>
@@ -516,7 +516,13 @@
                         <w:rPr>
                           <w:rFonts w:ascii="Cambria Math" w:hAnsi="Cambria Math"/>
                         </w:rPr>
-                        <m:t>x + a</m:t>
+                        <m:t xml:space="preserve">x + </m:t>
+                      </m:r>
+                      <m:r>
+                        <w:rPr>
+                          <w:rFonts w:ascii="Cambria Math" w:hAnsi="Cambria Math"/>
+                        </w:rPr>
+                        <m:t>a</m:t>
                       </m:r>
                     </m:e>
                   </m:d>
@@ -568,19 +574,13 @@
             <w:rPr>
               <w:rFonts w:ascii="Cambria Math" w:hAnsi="Cambria Math"/>
             </w:rPr>
-            <m:t xml:space="preserve"> =</m:t>
-          </m:r>
-          <m:r>
-            <w:rPr>
-              <w:rFonts w:ascii="Cambria Math" w:hAnsi="Cambria Math"/>
-            </w:rPr>
-            <m:t xml:space="preserve"> </m:t>
+            <m:t xml:space="preserve"> = </m:t>
           </m:r>
           <m:d>
             <m:dPr>
               <m:ctrlPr>
                 <w:rPr>
-                  <w:rFonts w:ascii="Cambria Math" w:hAnsi="Cambria Math"/>
+                  <w:rFonts w:ascii="Cambria Math" w:eastAsiaTheme="minorEastAsia" w:hAnsi="Cambria Math" w:cs="Times New Roman"/>
                   <w:i/>
                 </w:rPr>
               </m:ctrlPr>
@@ -608,7 +608,7 @@
                     <w:rPr>
                       <w:rFonts w:ascii="Cambria Math" w:hAnsi="Cambria Math"/>
                     </w:rPr>
-                    <m:t>2</m:t>
+                    <m:t>n</m:t>
                   </m:r>
                 </m:sup>
               </m:sSup>
@@ -632,13 +632,31 @@
                     <w:rPr>
                       <w:rFonts w:ascii="Cambria Math" w:hAnsi="Cambria Math"/>
                     </w:rPr>
-                    <m:t xml:space="preserve">2 × </m:t>
+                    <m:t>a</m:t>
                   </m:r>
                   <m:r>
                     <w:rPr>
                       <w:rFonts w:ascii="Cambria Math" w:hAnsi="Cambria Math"/>
                     </w:rPr>
-                    <m:t>x × a</m:t>
+                    <m:t xml:space="preserve"> × </m:t>
+                  </m:r>
+                  <m:r>
+                    <w:rPr>
+                      <w:rFonts w:ascii="Cambria Math" w:hAnsi="Cambria Math"/>
+                    </w:rPr>
+                    <m:t>x</m:t>
+                  </m:r>
+                  <m:r>
+                    <w:rPr>
+                      <w:rFonts w:ascii="Cambria Math" w:hAnsi="Cambria Math"/>
+                    </w:rPr>
+                    <m:t xml:space="preserve"> × </m:t>
+                  </m:r>
+                  <m:r>
+                    <w:rPr>
+                      <w:rFonts w:ascii="Cambria Math" w:hAnsi="Cambria Math"/>
+                    </w:rPr>
+                    <m:t>n</m:t>
                   </m:r>
                 </m:e>
               </m:d>
@@ -646,19 +664,13 @@
                 <w:rPr>
                   <w:rFonts w:ascii="Cambria Math" w:hAnsi="Cambria Math"/>
                 </w:rPr>
-                <m:t xml:space="preserve"> -</m:t>
-              </m:r>
-              <m:r>
-                <w:rPr>
-                  <w:rFonts w:ascii="Cambria Math" w:hAnsi="Cambria Math"/>
-                </w:rPr>
-                <m:t xml:space="preserve"> </m:t>
+                <m:t xml:space="preserve"> - </m:t>
               </m:r>
               <m:sSup>
                 <m:sSupPr>
                   <m:ctrlPr>
                     <w:rPr>
-                      <w:rFonts w:ascii="Cambria Math" w:hAnsi="Cambria Math"/>
+                      <w:rFonts w:ascii="Cambria Math" w:eastAsiaTheme="minorEastAsia" w:hAnsi="Cambria Math" w:cs="Times New Roman"/>
                       <w:i/>
                     </w:rPr>
                   </m:ctrlPr>
@@ -666,7 +678,7 @@
                 <m:e>
                   <m:r>
                     <w:rPr>
-                      <w:rFonts w:ascii="Cambria Math" w:hAnsi="Cambria Math"/>
+                      <w:rFonts w:ascii="Cambria Math" w:eastAsiaTheme="minorEastAsia" w:hAnsi="Cambria Math" w:cs="Times New Roman"/>
                     </w:rPr>
                     <m:t>x</m:t>
                   </m:r>
@@ -674,9 +686,9 @@
                 <m:sup>
                   <m:r>
                     <w:rPr>
-                      <w:rFonts w:ascii="Cambria Math" w:hAnsi="Cambria Math"/>
-                    </w:rPr>
-                    <m:t>2</m:t>
+                      <w:rFonts w:ascii="Cambria Math" w:eastAsiaTheme="minorEastAsia" w:hAnsi="Cambria Math" w:cs="Times New Roman"/>
+                    </w:rPr>
+                    <m:t>n</m:t>
                   </m:r>
                 </m:sup>
               </m:sSup>
@@ -684,12 +696,6 @@
           </m:d>
         </m:oMath>
       </m:oMathPara>
-    </w:p>
-    <w:p>
-      <w:pPr>
-        <w:spacing w:line="360" w:lineRule="auto"/>
-        <w:jc w:val="center"/>
-      </w:pPr>
     </w:p>
     <w:sectPr>
       <w:pgSz w:w="11906" w:h="16838" w:code="9"/>

</xml_diff>

<commit_message>
Exponential of Delta Exponent Variable | (21:26 (W.I.B [Waktu Indonesia bagian Barat]), 02/04/2026), Batam, Kepulauan Riau, Indonesia | Exponential of Delta Exponent Variable #EXODUS14VERSES14 #PROVERBS11VERSES24 #LUCAS8VERSES24
Exponential of Delta Exponent Variable | (21:26 (W.I.B [Waktu Indonesia bagian Barat]), 02/04/2026), Batam, Kepulauan Riau, Indonesia | Exponential of Delta Exponent Variable #EXODUS14VERSES14 #PROVERBS11VERSES24 #LUCAS8VERSES24
</commit_message>
<xml_diff>
--- a/Exponential of Delta Exponent Variable.docx
+++ b/Exponential of Delta Exponent Variable.docx
@@ -41,6 +41,7 @@
           <w:lang w:val="id-ID"/>
         </w:rPr>
       </w:pPr>
+      <w:proofErr w:type="spellStart"/>
       <w:r>
         <w:rPr>
           <w:rFonts w:ascii="Times New Roman" w:eastAsiaTheme="minorEastAsia" w:hAnsi="Times New Roman" w:cs="Times New Roman"/>
@@ -48,7 +49,37 @@
           <w:szCs w:val="24"/>
           <w:lang w:val="id-ID"/>
         </w:rPr>
-        <w:t>by : Samuel Hasiholan Omega Purba, S. Tr. T.</w:t>
+        <w:t>by</w:t>
+      </w:r>
+      <w:proofErr w:type="spellEnd"/>
+      <w:r>
+        <w:rPr>
+          <w:rFonts w:ascii="Times New Roman" w:eastAsiaTheme="minorEastAsia" w:hAnsi="Times New Roman" w:cs="Times New Roman"/>
+          <w:sz w:val="24"/>
+          <w:szCs w:val="24"/>
+          <w:lang w:val="id-ID"/>
+        </w:rPr>
+        <w:t xml:space="preserve"> : Samuel Hasiholan Omega Purba, S. </w:t>
+      </w:r>
+      <w:proofErr w:type="spellStart"/>
+      <w:r>
+        <w:rPr>
+          <w:rFonts w:ascii="Times New Roman" w:eastAsiaTheme="minorEastAsia" w:hAnsi="Times New Roman" w:cs="Times New Roman"/>
+          <w:sz w:val="24"/>
+          <w:szCs w:val="24"/>
+          <w:lang w:val="id-ID"/>
+        </w:rPr>
+        <w:t>Tr</w:t>
+      </w:r>
+      <w:proofErr w:type="spellEnd"/>
+      <w:r>
+        <w:rPr>
+          <w:rFonts w:ascii="Times New Roman" w:eastAsiaTheme="minorEastAsia" w:hAnsi="Times New Roman" w:cs="Times New Roman"/>
+          <w:sz w:val="24"/>
+          <w:szCs w:val="24"/>
+          <w:lang w:val="id-ID"/>
+        </w:rPr>
+        <w:t>. T.</w:t>
       </w:r>
     </w:p>
     <w:p>
@@ -83,6 +114,7 @@
           <w:lang w:val="id-ID"/>
         </w:rPr>
       </w:pPr>
+      <w:proofErr w:type="spellStart"/>
       <w:r>
         <w:rPr>
           <w:rFonts w:ascii="Times New Roman" w:eastAsiaTheme="minorEastAsia" w:hAnsi="Times New Roman" w:cs="Times New Roman"/>
@@ -90,7 +122,17 @@
           <w:szCs w:val="24"/>
           <w:lang w:val="id-ID"/>
         </w:rPr>
-        <w:t>Prodi Teknik Robotika dan Kecerdasan buatan</w:t>
+        <w:t>Prodi</w:t>
+      </w:r>
+      <w:proofErr w:type="spellEnd"/>
+      <w:r>
+        <w:rPr>
+          <w:rFonts w:ascii="Times New Roman" w:eastAsiaTheme="minorEastAsia" w:hAnsi="Times New Roman" w:cs="Times New Roman"/>
+          <w:sz w:val="24"/>
+          <w:szCs w:val="24"/>
+          <w:lang w:val="id-ID"/>
+        </w:rPr>
+        <w:t xml:space="preserve"> Teknik Robotika dan Kecerdasan buatan</w:t>
       </w:r>
     </w:p>
     <w:p>
@@ -479,6 +521,9 @@
       <w:pPr>
         <w:spacing w:line="360" w:lineRule="auto"/>
         <w:jc w:val="center"/>
+        <w:rPr>
+          <w:rFonts w:eastAsiaTheme="minorEastAsia"/>
+        </w:rPr>
       </w:pPr>
       <m:oMathPara>
         <m:oMath>
@@ -676,20 +721,320 @@
                   </m:ctrlPr>
                 </m:sSupPr>
                 <m:e>
-                  <m:r>
-                    <w:rPr>
-                      <w:rFonts w:ascii="Cambria Math" w:eastAsiaTheme="minorEastAsia" w:hAnsi="Cambria Math" w:cs="Times New Roman"/>
-                    </w:rPr>
-                    <m:t>x</m:t>
-                  </m:r>
+                  <m:d>
+                    <m:dPr>
+                      <m:ctrlPr>
+                        <w:rPr>
+                          <w:rFonts w:ascii="Cambria Math" w:eastAsiaTheme="minorEastAsia" w:hAnsi="Cambria Math" w:cs="Times New Roman"/>
+                          <w:i/>
+                        </w:rPr>
+                      </m:ctrlPr>
+                    </m:dPr>
+                    <m:e>
+                      <m:r>
+                        <w:rPr>
+                          <w:rFonts w:ascii="Cambria Math" w:eastAsiaTheme="minorEastAsia" w:hAnsi="Cambria Math" w:cs="Times New Roman"/>
+                        </w:rPr>
+                        <m:t xml:space="preserve">x × </m:t>
+                      </m:r>
+                      <m:d>
+                        <m:dPr>
+                          <m:ctrlPr>
+                            <w:rPr>
+                              <w:rFonts w:ascii="Cambria Math" w:eastAsiaTheme="minorEastAsia" w:hAnsi="Cambria Math" w:cs="Times New Roman"/>
+                              <w:i/>
+                            </w:rPr>
+                          </m:ctrlPr>
+                        </m:dPr>
+                        <m:e>
+                          <m:r>
+                            <w:rPr>
+                              <w:rFonts w:ascii="Cambria Math" w:eastAsiaTheme="minorEastAsia" w:hAnsi="Cambria Math" w:cs="Times New Roman"/>
+                            </w:rPr>
+                            <m:t>a-x</m:t>
+                          </m:r>
+                        </m:e>
+                      </m:d>
+                    </m:e>
+                  </m:d>
                 </m:e>
                 <m:sup>
-                  <m:r>
+                  <m:d>
+                    <m:dPr>
+                      <m:ctrlPr>
+                        <w:rPr>
+                          <w:rFonts w:ascii="Cambria Math" w:eastAsiaTheme="minorEastAsia" w:hAnsi="Cambria Math" w:cs="Times New Roman"/>
+                          <w:i/>
+                        </w:rPr>
+                      </m:ctrlPr>
+                    </m:dPr>
+                    <m:e>
+                      <m:r>
+                        <w:rPr>
+                          <w:rFonts w:ascii="Cambria Math" w:eastAsiaTheme="minorEastAsia" w:hAnsi="Cambria Math" w:cs="Times New Roman"/>
+                        </w:rPr>
+                        <m:t>n - 1</m:t>
+                      </m:r>
+                    </m:e>
+                  </m:d>
+                </m:sup>
+              </m:sSup>
+            </m:e>
+          </m:d>
+        </m:oMath>
+      </m:oMathPara>
+    </w:p>
+    <w:p>
+      <w:pPr>
+        <w:spacing w:line="360" w:lineRule="auto"/>
+        <w:jc w:val="center"/>
+        <w:rPr>
+          <w:rFonts w:ascii="Times New Roman" w:eastAsiaTheme="minorEastAsia" w:hAnsi="Times New Roman" w:cs="Times New Roman"/>
+          <w:sz w:val="24"/>
+          <w:szCs w:val="24"/>
+          <w:lang w:val="id-ID"/>
+        </w:rPr>
+      </w:pPr>
+    </w:p>
+    <w:p>
+      <w:pPr>
+        <w:spacing w:line="360" w:lineRule="auto"/>
+        <w:jc w:val="center"/>
+      </w:pPr>
+      <m:oMathPara>
+        <m:oMath>
+          <m:d>
+            <m:dPr>
+              <m:ctrlPr>
+                <w:rPr>
+                  <w:rFonts w:ascii="Cambria Math" w:eastAsiaTheme="minorEastAsia" w:hAnsi="Cambria Math" w:cs="Times New Roman"/>
+                  <w:i/>
+                </w:rPr>
+              </m:ctrlPr>
+            </m:dPr>
+            <m:e>
+              <m:sSup>
+                <m:sSupPr>
+                  <m:ctrlPr>
+                    <w:rPr>
+                      <w:rFonts w:ascii="Cambria Math" w:hAnsi="Cambria Math"/>
+                      <w:i/>
+                    </w:rPr>
+                  </m:ctrlPr>
+                </m:sSupPr>
+                <m:e>
+                  <m:d>
+                    <m:dPr>
+                      <m:ctrlPr>
+                        <w:rPr>
+                          <w:rFonts w:ascii="Cambria Math" w:hAnsi="Cambria Math"/>
+                          <w:i/>
+                        </w:rPr>
+                      </m:ctrlPr>
+                    </m:dPr>
+                    <m:e>
+                      <m:r>
+                        <w:rPr>
+                          <w:rFonts w:ascii="Cambria Math" w:hAnsi="Cambria Math"/>
+                        </w:rPr>
+                        <m:t>x + a</m:t>
+                      </m:r>
+                    </m:e>
+                  </m:d>
+                </m:e>
+                <m:sup>
+                  <m:r>
+                    <w:rPr>
+                      <w:rFonts w:ascii="Cambria Math" w:hAnsi="Cambria Math"/>
+                    </w:rPr>
+                    <m:t>n</m:t>
+                  </m:r>
+                </m:sup>
+              </m:sSup>
+              <m:r>
+                <w:rPr>
+                  <w:rFonts w:ascii="Cambria Math" w:hAnsi="Cambria Math"/>
+                </w:rPr>
+                <m:t xml:space="preserve"> - </m:t>
+              </m:r>
+              <m:sSup>
+                <m:sSupPr>
+                  <m:ctrlPr>
                     <w:rPr>
                       <w:rFonts w:ascii="Cambria Math" w:eastAsiaTheme="minorEastAsia" w:hAnsi="Cambria Math" w:cs="Times New Roman"/>
+                      <w:i/>
+                    </w:rPr>
+                  </m:ctrlPr>
+                </m:sSupPr>
+                <m:e>
+                  <m:r>
+                    <w:rPr>
+                      <w:rFonts w:ascii="Cambria Math" w:eastAsiaTheme="minorEastAsia" w:hAnsi="Cambria Math" w:cs="Times New Roman"/>
+                    </w:rPr>
+                    <m:t>x</m:t>
+                  </m:r>
+                </m:e>
+                <m:sup>
+                  <m:r>
+                    <w:rPr>
+                      <w:rFonts w:ascii="Cambria Math" w:eastAsiaTheme="minorEastAsia" w:hAnsi="Cambria Math" w:cs="Times New Roman"/>
                     </w:rPr>
                     <m:t>n</m:t>
                   </m:r>
+                </m:sup>
+              </m:sSup>
+            </m:e>
+          </m:d>
+          <m:r>
+            <w:rPr>
+              <w:rFonts w:ascii="Cambria Math" w:hAnsi="Cambria Math"/>
+            </w:rPr>
+            <m:t xml:space="preserve"> = </m:t>
+          </m:r>
+          <m:d>
+            <m:dPr>
+              <m:ctrlPr>
+                <w:rPr>
+                  <w:rFonts w:ascii="Cambria Math" w:eastAsiaTheme="minorEastAsia" w:hAnsi="Cambria Math" w:cs="Times New Roman"/>
+                  <w:i/>
+                </w:rPr>
+              </m:ctrlPr>
+            </m:dPr>
+            <m:e>
+              <m:sSup>
+                <m:sSupPr>
+                  <m:ctrlPr>
+                    <w:rPr>
+                      <w:rFonts w:ascii="Cambria Math" w:hAnsi="Cambria Math"/>
+                      <w:i/>
+                    </w:rPr>
+                  </m:ctrlPr>
+                </m:sSupPr>
+                <m:e>
+                  <m:r>
+                    <w:rPr>
+                      <w:rFonts w:ascii="Cambria Math" w:hAnsi="Cambria Math"/>
+                    </w:rPr>
+                    <m:t>a</m:t>
+                  </m:r>
+                </m:e>
+                <m:sup>
+                  <m:r>
+                    <w:rPr>
+                      <w:rFonts w:ascii="Cambria Math" w:hAnsi="Cambria Math"/>
+                    </w:rPr>
+                    <m:t>n</m:t>
+                  </m:r>
+                </m:sup>
+              </m:sSup>
+              <m:r>
+                <w:rPr>
+                  <w:rFonts w:ascii="Cambria Math" w:hAnsi="Cambria Math"/>
+                </w:rPr>
+                <m:t xml:space="preserve"> + </m:t>
+              </m:r>
+              <m:d>
+                <m:dPr>
+                  <m:ctrlPr>
+                    <w:rPr>
+                      <w:rFonts w:ascii="Cambria Math" w:hAnsi="Cambria Math"/>
+                      <w:i/>
+                    </w:rPr>
+                  </m:ctrlPr>
+                </m:dPr>
+                <m:e>
+                  <m:r>
+                    <w:rPr>
+                      <w:rFonts w:ascii="Cambria Math" w:hAnsi="Cambria Math"/>
+                    </w:rPr>
+                    <m:t>a × x × n</m:t>
+                  </m:r>
+                </m:e>
+              </m:d>
+              <m:r>
+                <w:rPr>
+                  <w:rFonts w:ascii="Cambria Math" w:hAnsi="Cambria Math"/>
+                </w:rPr>
+                <m:t xml:space="preserve"> - </m:t>
+              </m:r>
+              <m:d>
+                <m:dPr>
+                  <m:ctrlPr>
+                    <w:rPr>
+                      <w:rFonts w:ascii="Cambria Math" w:eastAsiaTheme="minorEastAsia" w:hAnsi="Cambria Math" w:cs="Times New Roman"/>
+                      <w:i/>
+                    </w:rPr>
+                  </m:ctrlPr>
+                </m:dPr>
+                <m:e>
+                  <m:r>
+                    <w:rPr>
+                      <w:rFonts w:ascii="Cambria Math" w:eastAsiaTheme="minorEastAsia" w:hAnsi="Cambria Math" w:cs="Times New Roman"/>
+                    </w:rPr>
+                    <m:t>x × a</m:t>
+                  </m:r>
+                </m:e>
+              </m:d>
+              <m:r>
+                <w:rPr>
+                  <w:rFonts w:ascii="Cambria Math" w:eastAsiaTheme="minorEastAsia" w:hAnsi="Cambria Math" w:cs="Times New Roman"/>
+                </w:rPr>
+                <m:t xml:space="preserve"> + </m:t>
+              </m:r>
+              <m:sSup>
+                <m:sSupPr>
+                  <m:ctrlPr>
+                    <w:rPr>
+                      <w:rFonts w:ascii="Cambria Math" w:eastAsiaTheme="minorEastAsia" w:hAnsi="Cambria Math" w:cs="Times New Roman"/>
+                      <w:i/>
+                    </w:rPr>
+                  </m:ctrlPr>
+                </m:sSupPr>
+                <m:e>
+                  <m:r>
+                    <w:rPr>
+                      <w:rFonts w:ascii="Cambria Math" w:eastAsiaTheme="minorEastAsia" w:hAnsi="Cambria Math" w:cs="Times New Roman"/>
+                    </w:rPr>
+                    <m:t>x</m:t>
+                  </m:r>
+                </m:e>
+                <m:sup>
+                  <m:d>
+                    <m:dPr>
+                      <m:ctrlPr>
+                        <w:rPr>
+                          <w:rFonts w:ascii="Cambria Math" w:eastAsiaTheme="minorEastAsia" w:hAnsi="Cambria Math" w:cs="Times New Roman"/>
+                          <w:i/>
+                        </w:rPr>
+                      </m:ctrlPr>
+                    </m:dPr>
+                    <m:e>
+                      <m:d>
+                        <m:dPr>
+                          <m:ctrlPr>
+                            <w:rPr>
+                              <w:rFonts w:ascii="Cambria Math" w:eastAsiaTheme="minorEastAsia" w:hAnsi="Cambria Math" w:cs="Times New Roman"/>
+                              <w:i/>
+                            </w:rPr>
+                          </m:ctrlPr>
+                        </m:dPr>
+                        <m:e>
+                          <m:r>
+                            <w:rPr>
+                              <w:rFonts w:ascii="Cambria Math" w:eastAsiaTheme="minorEastAsia" w:hAnsi="Cambria Math" w:cs="Times New Roman"/>
+                            </w:rPr>
+                            <m:t>2 × n</m:t>
+                          </m:r>
+                        </m:e>
+                      </m:d>
+                      <m:r>
+                        <w:rPr>
+                          <w:rFonts w:ascii="Cambria Math" w:eastAsiaTheme="minorEastAsia" w:hAnsi="Cambria Math" w:cs="Times New Roman"/>
+                        </w:rPr>
+                        <m:t xml:space="preserve"> - 1</m:t>
+                      </m:r>
+                    </m:e>
+                  </m:d>
                 </m:sup>
               </m:sSup>
             </m:e>

</xml_diff>

<commit_message>
Exponential of Delta Exponent Variable | (21:41 (W.I.B [Waktu Indonesia bagian Barat]), 02/04/2026), Batam, Kepulauan Riau, Indonesia | Exponential of Delta Exponent Variable #EXODUS14VERSES14 #PROVERBS11VERSES24 #LUCAS8VERSES24
Exponential of Delta Exponent Variable | (21:41 (W.I.B [Waktu Indonesia bagian Barat]), 02/04/2026), Batam, Kepulauan Riau, Indonesia | Exponential of Delta Exponent Variable #EXODUS14VERSES14 #PROVERBS11VERSES24 #LUCAS8VERSES24
</commit_message>
<xml_diff>
--- a/Exponential of Delta Exponent Variable.docx
+++ b/Exponential of Delta Exponent Variable.docx
@@ -665,6 +665,8 @@
               </m:r>
               <m:d>
                 <m:dPr>
+                  <m:begChr m:val="{"/>
+                  <m:endChr m:val="}"/>
                   <m:ctrlPr>
                     <w:rPr>
                       <w:rFonts w:ascii="Cambria Math" w:hAnsi="Cambria Math"/>
@@ -723,6 +725,8 @@
                 <m:e>
                   <m:d>
                     <m:dPr>
+                      <m:begChr m:val="{"/>
+                      <m:endChr m:val="}"/>
                       <m:ctrlPr>
                         <w:rPr>
                           <w:rFonts w:ascii="Cambria Math" w:eastAsiaTheme="minorEastAsia" w:hAnsi="Cambria Math" w:cs="Times New Roman"/>
@@ -935,6 +939,8 @@
               </m:r>
               <m:d>
                 <m:dPr>
+                  <m:begChr m:val="{"/>
+                  <m:endChr m:val="}"/>
                   <m:ctrlPr>
                     <w:rPr>
                       <w:rFonts w:ascii="Cambria Math" w:hAnsi="Cambria Math"/>
@@ -957,24 +963,58 @@
                 </w:rPr>
                 <m:t xml:space="preserve"> - </m:t>
               </m:r>
-              <m:d>
-                <m:dPr>
+              <m:sSup>
+                <m:sSupPr>
                   <m:ctrlPr>
                     <w:rPr>
                       <w:rFonts w:ascii="Cambria Math" w:eastAsiaTheme="minorEastAsia" w:hAnsi="Cambria Math" w:cs="Times New Roman"/>
                       <w:i/>
                     </w:rPr>
                   </m:ctrlPr>
-                </m:dPr>
+                </m:sSupPr>
                 <m:e>
-                  <m:r>
-                    <w:rPr>
-                      <w:rFonts w:ascii="Cambria Math" w:eastAsiaTheme="minorEastAsia" w:hAnsi="Cambria Math" w:cs="Times New Roman"/>
-                    </w:rPr>
-                    <m:t>x × a</m:t>
-                  </m:r>
+                  <m:d>
+                    <m:dPr>
+                      <m:begChr m:val="{"/>
+                      <m:endChr m:val="}"/>
+                      <m:ctrlPr>
+                        <w:rPr>
+                          <w:rFonts w:ascii="Cambria Math" w:eastAsiaTheme="minorEastAsia" w:hAnsi="Cambria Math" w:cs="Times New Roman"/>
+                          <w:i/>
+                        </w:rPr>
+                      </m:ctrlPr>
+                    </m:dPr>
+                    <m:e>
+                      <m:r>
+                        <w:rPr>
+                          <w:rFonts w:ascii="Cambria Math" w:eastAsiaTheme="minorEastAsia" w:hAnsi="Cambria Math" w:cs="Times New Roman"/>
+                        </w:rPr>
+                        <m:t>x × a</m:t>
+                      </m:r>
+                    </m:e>
+                  </m:d>
                 </m:e>
-              </m:d>
+                <m:sup>
+                  <m:d>
+                    <m:dPr>
+                      <m:ctrlPr>
+                        <w:rPr>
+                          <w:rFonts w:ascii="Cambria Math" w:eastAsiaTheme="minorEastAsia" w:hAnsi="Cambria Math" w:cs="Times New Roman"/>
+                          <w:i/>
+                        </w:rPr>
+                      </m:ctrlPr>
+                    </m:dPr>
+                    <m:e>
+                      <m:r>
+                        <w:rPr>
+                          <w:rFonts w:ascii="Cambria Math" w:eastAsiaTheme="minorEastAsia" w:hAnsi="Cambria Math" w:cs="Times New Roman"/>
+                        </w:rPr>
+                        <m:t>n - 1</m:t>
+                      </m:r>
+                    </m:e>
+                  </m:d>
+                </m:sup>
+              </m:sSup>
               <m:r>
                 <w:rPr>
                   <w:rFonts w:ascii="Cambria Math" w:eastAsiaTheme="minorEastAsia" w:hAnsi="Cambria Math" w:cs="Times New Roman"/>

</xml_diff>